<commit_message>
docs: corrección formato planes
</commit_message>
<xml_diff>
--- a/Documentacion/Planificacion/PLAN DE DIRECCIÓN DEL PROYECTO.docx
+++ b/Documentacion/Planificacion/PLAN DE DIRECCIÓN DEL PROYECTO.docx
@@ -9,8 +9,8 @@
         <w:tblLook w:val="04A0" w:firstRow="1" w:lastRow="0" w:firstColumn="1" w:lastColumn="0" w:noHBand="0" w:noVBand="1"/>
       </w:tblPr>
       <w:tblGrid>
-        <w:gridCol w:w="4351"/>
-        <w:gridCol w:w="6105"/>
+        <w:gridCol w:w="4346"/>
+        <w:gridCol w:w="6110"/>
       </w:tblGrid>
       <w:tr>
         <w:tc>
@@ -25,12 +25,16 @@
               <w:rPr>
                 <w:rFonts w:ascii="Tahoma" w:hAnsi="Tahoma" w:cs="Tahoma"/>
                 <w:b/>
+                <w:sz w:val="20"/>
+                <w:szCs w:val="20"/>
               </w:rPr>
             </w:pPr>
             <w:r>
               <w:rPr>
                 <w:rFonts w:ascii="Tahoma" w:hAnsi="Tahoma" w:cs="Tahoma"/>
                 <w:b/>
+                <w:sz w:val="20"/>
+                <w:szCs w:val="20"/>
               </w:rPr>
               <w:t>NOMBRE DEL PROYECTO:</w:t>
             </w:r>
@@ -71,12 +75,16 @@
               <w:rPr>
                 <w:rFonts w:ascii="Tahoma" w:hAnsi="Tahoma" w:cs="Tahoma"/>
                 <w:b/>
+                <w:sz w:val="20"/>
+                <w:szCs w:val="20"/>
               </w:rPr>
             </w:pPr>
             <w:r>
               <w:rPr>
                 <w:rFonts w:ascii="Tahoma" w:hAnsi="Tahoma" w:cs="Tahoma"/>
                 <w:b/>
+                <w:sz w:val="20"/>
+                <w:szCs w:val="20"/>
               </w:rPr>
               <w:t>CÓDIGO DEL PROYECTO:</w:t>
             </w:r>
@@ -121,12 +129,16 @@
               <w:rPr>
                 <w:rFonts w:ascii="Tahoma" w:hAnsi="Tahoma" w:cs="Tahoma"/>
                 <w:b/>
+                <w:sz w:val="20"/>
+                <w:szCs w:val="20"/>
               </w:rPr>
             </w:pPr>
             <w:r>
               <w:rPr>
                 <w:rFonts w:ascii="Tahoma" w:hAnsi="Tahoma" w:cs="Tahoma"/>
                 <w:b/>
+                <w:sz w:val="20"/>
+                <w:szCs w:val="20"/>
               </w:rPr>
               <w:t>PROPIETARIO DEL PROYECTO:</w:t>
             </w:r>
@@ -171,12 +183,16 @@
               <w:rPr>
                 <w:rFonts w:ascii="Tahoma" w:hAnsi="Tahoma" w:cs="Tahoma"/>
                 <w:b/>
+                <w:sz w:val="20"/>
+                <w:szCs w:val="20"/>
               </w:rPr>
             </w:pPr>
             <w:r>
               <w:rPr>
                 <w:rFonts w:ascii="Tahoma" w:hAnsi="Tahoma" w:cs="Tahoma"/>
                 <w:b/>
+                <w:sz w:val="20"/>
+                <w:szCs w:val="20"/>
               </w:rPr>
               <w:t>DIRECTOR DEL PROYECTO:</w:t>
             </w:r>
@@ -230,12 +246,16 @@
               <w:rPr>
                 <w:rFonts w:ascii="Tahoma" w:hAnsi="Tahoma" w:cs="Tahoma"/>
                 <w:b/>
+                <w:sz w:val="20"/>
+                <w:szCs w:val="20"/>
               </w:rPr>
             </w:pPr>
             <w:r>
               <w:rPr>
                 <w:rFonts w:ascii="Tahoma" w:hAnsi="Tahoma" w:cs="Tahoma"/>
                 <w:b/>
+                <w:sz w:val="20"/>
+                <w:szCs w:val="20"/>
               </w:rPr>
               <w:t>FECHA DE CREACIÓN:</w:t>
             </w:r>
@@ -280,12 +300,16 @@
               <w:rPr>
                 <w:rFonts w:ascii="Tahoma" w:hAnsi="Tahoma" w:cs="Tahoma"/>
                 <w:b/>
+                <w:sz w:val="20"/>
+                <w:szCs w:val="20"/>
               </w:rPr>
             </w:pPr>
             <w:r>
               <w:rPr>
                 <w:rFonts w:ascii="Tahoma" w:hAnsi="Tahoma" w:cs="Tahoma"/>
                 <w:b/>
+                <w:sz w:val="20"/>
+                <w:szCs w:val="20"/>
               </w:rPr>
               <w:t>ELABORADO POR:</w:t>
             </w:r>
@@ -397,12 +421,16 @@
               <w:rPr>
                 <w:rFonts w:ascii="Tahoma" w:hAnsi="Tahoma" w:cs="Tahoma"/>
                 <w:b/>
+                <w:sz w:val="20"/>
+                <w:szCs w:val="20"/>
               </w:rPr>
             </w:pPr>
             <w:r>
               <w:rPr>
                 <w:rFonts w:ascii="Tahoma" w:hAnsi="Tahoma" w:cs="Tahoma"/>
                 <w:b/>
+                <w:sz w:val="20"/>
+                <w:szCs w:val="20"/>
               </w:rPr>
               <w:t>VERSIÓN DEL DOCUMENTO:</w:t>
             </w:r>
@@ -437,29 +465,15 @@
     </w:tbl>
     <w:p>
       <w:pPr>
-        <w:spacing w:after="0" w:afterAutospacing="0"/>
-        <w:rPr>
-          <w:rFonts w:ascii="Tahoma" w:hAnsi="Tahoma" w:cs="Tahoma"/>
-        </w:rPr>
-      </w:pPr>
-    </w:p>
-    <w:p>
-      <w:pPr>
-        <w:shd w:val="clear" w:color="auto" w:fill="D9D9D9" w:themeFill="background1" w:themeFillShade="D9"/>
         <w:spacing w:after="0" w:afterAutospacing="0"/>
         <w:jc w:val="both"/>
         <w:rPr>
           <w:rFonts w:ascii="Tahoma" w:hAnsi="Tahoma" w:cs="Tahoma"/>
           <w:b/>
+          <w:sz w:val="20"/>
+          <w:szCs w:val="20"/>
         </w:rPr>
       </w:pPr>
-      <w:r>
-        <w:rPr>
-          <w:rFonts w:ascii="Tahoma" w:hAnsi="Tahoma" w:cs="Tahoma"/>
-          <w:b/>
-        </w:rPr>
-        <w:t>HISTÓRICO DE MODIFICACIONES DEL DOCUMENTO</w:t>
-      </w:r>
     </w:p>
     <w:tbl>
       <w:tblPr>
@@ -486,6 +500,43 @@
       <w:tr>
         <w:tc>
           <w:tcPr>
+            <w:tcW w:w="5000" w:type="pct"/>
+            <w:gridSpan w:val="3"/>
+            <w:tcBorders>
+              <w:top w:val="single" w:sz="4" w:space="0" w:color="7F7F7F" w:themeColor="text1" w:themeTint="80"/>
+              <w:left w:val="single" w:sz="4" w:space="0" w:color="7F7F7F" w:themeColor="text1" w:themeTint="80"/>
+              <w:bottom w:val="single" w:sz="4" w:space="0" w:color="7F7F7F" w:themeColor="text1" w:themeTint="80"/>
+              <w:right w:val="single" w:sz="4" w:space="0" w:color="7F7F7F" w:themeColor="text1" w:themeTint="80"/>
+            </w:tcBorders>
+            <w:shd w:val="clear" w:color="auto" w:fill="D9D9D9"/>
+          </w:tcPr>
+          <w:p>
+            <w:pPr>
+              <w:shd w:val="clear" w:color="auto" w:fill="D9D9D9" w:themeFill="background1" w:themeFillShade="D9"/>
+              <w:spacing w:after="0" w:afterAutospacing="0"/>
+              <w:jc w:val="both"/>
+              <w:rPr>
+                <w:rFonts w:ascii="Tahoma" w:hAnsi="Tahoma" w:cs="Tahoma"/>
+                <w:b/>
+                <w:sz w:val="20"/>
+                <w:szCs w:val="20"/>
+              </w:rPr>
+            </w:pPr>
+            <w:r>
+              <w:rPr>
+                <w:rFonts w:ascii="Tahoma" w:hAnsi="Tahoma" w:cs="Tahoma"/>
+                <w:b/>
+                <w:sz w:val="20"/>
+                <w:szCs w:val="20"/>
+              </w:rPr>
+              <w:t>HISTÓRICO DE MODIFICACIONES DEL DOCUMENTO</w:t>
+            </w:r>
+          </w:p>
+        </w:tc>
+      </w:tr>
+      <w:tr>
+        <w:tc>
+          <w:tcPr>
             <w:tcW w:w="605" w:type="pct"/>
             <w:tcBorders>
               <w:top w:val="single" w:sz="4" w:space="0" w:color="7F7F7F" w:themeColor="text1" w:themeTint="80"/>
@@ -504,6 +555,8 @@
                 <w:b/>
                 <w:bCs/>
                 <w:color w:val="000000"/>
+                <w:sz w:val="20"/>
+                <w:szCs w:val="20"/>
               </w:rPr>
             </w:pPr>
             <w:r>
@@ -512,6 +565,8 @@
                 <w:b/>
                 <w:bCs/>
                 <w:color w:val="000000"/>
+                <w:sz w:val="20"/>
+                <w:szCs w:val="20"/>
               </w:rPr>
               <w:t>Fecha</w:t>
             </w:r>
@@ -537,6 +592,8 @@
                 <w:b/>
                 <w:bCs/>
                 <w:color w:val="000000"/>
+                <w:sz w:val="20"/>
+                <w:szCs w:val="20"/>
               </w:rPr>
             </w:pPr>
             <w:r>
@@ -545,6 +602,8 @@
                 <w:b/>
                 <w:bCs/>
                 <w:color w:val="000000"/>
+                <w:sz w:val="20"/>
+                <w:szCs w:val="20"/>
               </w:rPr>
               <w:t>Realizada por</w:t>
             </w:r>
@@ -570,6 +629,8 @@
                 <w:b/>
                 <w:bCs/>
                 <w:color w:val="000000"/>
+                <w:sz w:val="20"/>
+                <w:szCs w:val="20"/>
               </w:rPr>
             </w:pPr>
             <w:r>
@@ -578,6 +639,8 @@
                 <w:b/>
                 <w:bCs/>
                 <w:color w:val="000000"/>
+                <w:sz w:val="20"/>
+                <w:szCs w:val="20"/>
               </w:rPr>
               <w:t>Breve descripción de los cambios</w:t>
             </w:r>
@@ -692,16 +755,6 @@
     </w:tbl>
     <w:p>
       <w:pPr>
-        <w:spacing w:after="0" w:afterAutospacing="0"/>
-        <w:rPr>
-          <w:rFonts w:ascii="Tahoma" w:hAnsi="Tahoma" w:cs="Tahoma"/>
-          <w:sz w:val="20"/>
-        </w:rPr>
-      </w:pPr>
-    </w:p>
-    <w:p>
-      <w:pPr>
-        <w:shd w:val="clear" w:color="auto" w:fill="D9D9D9" w:themeFill="background1" w:themeFillShade="D9"/>
         <w:tabs>
           <w:tab w:val="right" w:pos="10466"/>
         </w:tabs>
@@ -711,13 +764,6 @@
           <w:b/>
         </w:rPr>
       </w:pPr>
-      <w:r>
-        <w:rPr>
-          <w:rFonts w:ascii="Tahoma" w:hAnsi="Tahoma" w:cs="Tahoma"/>
-          <w:b/>
-        </w:rPr>
-        <w:t>OBJETIVOS DEL PROYECTO</w:t>
-      </w:r>
       <w:r>
         <w:rPr>
           <w:rFonts w:ascii="Tahoma" w:hAnsi="Tahoma" w:cs="Tahoma"/>
@@ -738,7 +784,50 @@
       </w:tblGrid>
       <w:tr>
         <w:trPr>
-          <w:trHeight w:val="403"/>
+          <w:trHeight w:val="194"/>
+        </w:trPr>
+        <w:tc>
+          <w:tcPr>
+            <w:tcW w:w="10485" w:type="dxa"/>
+            <w:gridSpan w:val="2"/>
+            <w:shd w:val="clear" w:color="auto" w:fill="D9D9D9" w:themeFill="background1" w:themeFillShade="D9"/>
+          </w:tcPr>
+          <w:p>
+            <w:pPr>
+              <w:shd w:val="clear" w:color="auto" w:fill="D9D9D9" w:themeFill="background1" w:themeFillShade="D9"/>
+              <w:spacing w:after="0" w:afterAutospacing="0"/>
+              <w:jc w:val="both"/>
+              <w:rPr>
+                <w:rFonts w:ascii="Tahoma" w:hAnsi="Tahoma" w:cs="Tahoma"/>
+                <w:b/>
+                <w:sz w:val="20"/>
+                <w:szCs w:val="20"/>
+              </w:rPr>
+            </w:pPr>
+            <w:r>
+              <w:rPr>
+                <w:rFonts w:ascii="Tahoma" w:hAnsi="Tahoma" w:cs="Tahoma"/>
+                <w:b/>
+                <w:sz w:val="20"/>
+                <w:szCs w:val="20"/>
+              </w:rPr>
+              <w:t>OBJETIVOS DEL PROYECTO</w:t>
+            </w:r>
+            <w:r>
+              <w:rPr>
+                <w:rFonts w:ascii="Tahoma" w:hAnsi="Tahoma" w:cs="Tahoma"/>
+                <w:b/>
+                <w:sz w:val="20"/>
+                <w:szCs w:val="20"/>
+              </w:rPr>
+              <w:tab/>
+            </w:r>
+          </w:p>
+        </w:tc>
+      </w:tr>
+      <w:tr>
+        <w:trPr>
+          <w:trHeight w:val="200"/>
         </w:trPr>
         <w:tc>
           <w:tcPr>
@@ -747,17 +836,22 @@
           </w:tcPr>
           <w:p>
             <w:pPr>
-              <w:spacing w:afterAutospacing="0"/>
-              <w:jc w:val="center"/>
+              <w:shd w:val="clear" w:color="auto" w:fill="D9D9D9" w:themeFill="background1" w:themeFillShade="D9"/>
+              <w:spacing w:after="0" w:afterAutospacing="0"/>
+              <w:jc w:val="both"/>
               <w:rPr>
                 <w:rFonts w:ascii="Tahoma" w:hAnsi="Tahoma" w:cs="Tahoma"/>
                 <w:b/>
+                <w:sz w:val="20"/>
+                <w:szCs w:val="20"/>
               </w:rPr>
             </w:pPr>
             <w:r>
               <w:rPr>
                 <w:rFonts w:ascii="Tahoma" w:hAnsi="Tahoma" w:cs="Tahoma"/>
                 <w:b/>
+                <w:sz w:val="20"/>
+                <w:szCs w:val="20"/>
               </w:rPr>
               <w:t>Id</w:t>
             </w:r>
@@ -770,17 +864,22 @@
           </w:tcPr>
           <w:p>
             <w:pPr>
-              <w:spacing w:afterAutospacing="0"/>
-              <w:jc w:val="center"/>
+              <w:shd w:val="clear" w:color="auto" w:fill="D9D9D9" w:themeFill="background1" w:themeFillShade="D9"/>
+              <w:spacing w:after="0" w:afterAutospacing="0"/>
+              <w:jc w:val="both"/>
               <w:rPr>
                 <w:rFonts w:ascii="Tahoma" w:hAnsi="Tahoma" w:cs="Tahoma"/>
                 <w:b/>
+                <w:sz w:val="20"/>
+                <w:szCs w:val="20"/>
               </w:rPr>
             </w:pPr>
             <w:r>
               <w:rPr>
                 <w:rFonts w:ascii="Tahoma" w:hAnsi="Tahoma" w:cs="Tahoma"/>
                 <w:b/>
+                <w:sz w:val="20"/>
+                <w:szCs w:val="20"/>
               </w:rPr>
               <w:t>Objetivo</w:t>
             </w:r>
@@ -1244,26 +1343,9 @@
         <w:spacing w:after="0" w:afterAutospacing="0"/>
         <w:rPr>
           <w:rFonts w:ascii="Tahoma" w:hAnsi="Tahoma" w:cs="Tahoma"/>
-          <w:sz w:val="20"/>
-        </w:rPr>
-      </w:pPr>
-    </w:p>
-    <w:p>
-      <w:pPr>
-        <w:shd w:val="clear" w:color="auto" w:fill="D9D9D9" w:themeFill="background1" w:themeFillShade="D9"/>
-        <w:spacing w:after="0" w:afterAutospacing="0"/>
-        <w:rPr>
-          <w:rFonts w:ascii="Tahoma" w:hAnsi="Tahoma" w:cs="Tahoma"/>
           <w:b/>
         </w:rPr>
       </w:pPr>
-      <w:r>
-        <w:rPr>
-          <w:rFonts w:ascii="Tahoma" w:hAnsi="Tahoma" w:cs="Tahoma"/>
-          <w:b/>
-        </w:rPr>
-        <w:t>CICLO DE VIDA DEL PROYECTO</w:t>
-      </w:r>
     </w:p>
     <w:tbl>
       <w:tblPr>
@@ -1280,7 +1362,37 @@
       <w:tr>
         <w:tc>
           <w:tcPr>
-            <w:tcW w:w="2735" w:type="dxa"/>
+            <w:tcW w:w="10456" w:type="dxa"/>
+            <w:gridSpan w:val="4"/>
+            <w:shd w:val="clear" w:color="auto" w:fill="D9D9D9" w:themeFill="background1" w:themeFillShade="D9"/>
+          </w:tcPr>
+          <w:p>
+            <w:pPr>
+              <w:shd w:val="clear" w:color="auto" w:fill="D9D9D9" w:themeFill="background1" w:themeFillShade="D9"/>
+              <w:spacing w:after="0" w:afterAutospacing="0"/>
+              <w:rPr>
+                <w:rFonts w:ascii="Tahoma" w:hAnsi="Tahoma" w:cs="Tahoma"/>
+                <w:b/>
+                <w:sz w:val="20"/>
+                <w:szCs w:val="20"/>
+              </w:rPr>
+            </w:pPr>
+            <w:r>
+              <w:rPr>
+                <w:rFonts w:ascii="Tahoma" w:hAnsi="Tahoma" w:cs="Tahoma"/>
+                <w:b/>
+                <w:sz w:val="20"/>
+                <w:szCs w:val="20"/>
+              </w:rPr>
+              <w:t>CICLO DE VIDA DEL PROYECTO</w:t>
+            </w:r>
+          </w:p>
+        </w:tc>
+      </w:tr>
+      <w:tr>
+        <w:tc>
+          <w:tcPr>
+            <w:tcW w:w="2588" w:type="dxa"/>
             <w:shd w:val="clear" w:color="auto" w:fill="D9D9D9" w:themeFill="background1" w:themeFillShade="D9"/>
           </w:tcPr>
           <w:p>
@@ -1290,12 +1402,16 @@
               <w:rPr>
                 <w:rFonts w:ascii="Tahoma" w:hAnsi="Tahoma" w:cs="Tahoma"/>
                 <w:b/>
+                <w:sz w:val="20"/>
+                <w:szCs w:val="20"/>
               </w:rPr>
             </w:pPr>
             <w:r>
               <w:rPr>
                 <w:rFonts w:ascii="Tahoma" w:hAnsi="Tahoma" w:cs="Tahoma"/>
                 <w:b/>
+                <w:sz w:val="20"/>
+                <w:szCs w:val="20"/>
               </w:rPr>
               <w:t>FASE</w:t>
             </w:r>
@@ -1303,7 +1419,7 @@
         </w:tc>
         <w:tc>
           <w:tcPr>
-            <w:tcW w:w="2735" w:type="dxa"/>
+            <w:tcW w:w="2636" w:type="dxa"/>
             <w:shd w:val="clear" w:color="auto" w:fill="D9D9D9" w:themeFill="background1" w:themeFillShade="D9"/>
           </w:tcPr>
           <w:p>
@@ -1313,12 +1429,16 @@
               <w:rPr>
                 <w:rFonts w:ascii="Tahoma" w:hAnsi="Tahoma" w:cs="Tahoma"/>
                 <w:b/>
+                <w:sz w:val="20"/>
+                <w:szCs w:val="20"/>
               </w:rPr>
             </w:pPr>
             <w:r>
               <w:rPr>
                 <w:rFonts w:ascii="Tahoma" w:hAnsi="Tahoma" w:cs="Tahoma"/>
                 <w:b/>
+                <w:sz w:val="20"/>
+                <w:szCs w:val="20"/>
               </w:rPr>
               <w:t>ACTIVIDADES CLAVE</w:t>
             </w:r>
@@ -1326,7 +1446,7 @@
         </w:tc>
         <w:tc>
           <w:tcPr>
-            <w:tcW w:w="2735" w:type="dxa"/>
+            <w:tcW w:w="2641" w:type="dxa"/>
             <w:shd w:val="clear" w:color="auto" w:fill="D9D9D9" w:themeFill="background1" w:themeFillShade="D9"/>
           </w:tcPr>
           <w:p>
@@ -1336,12 +1456,16 @@
               <w:rPr>
                 <w:rFonts w:ascii="Tahoma" w:hAnsi="Tahoma" w:cs="Tahoma"/>
                 <w:b/>
+                <w:sz w:val="20"/>
+                <w:szCs w:val="20"/>
               </w:rPr>
             </w:pPr>
             <w:r>
               <w:rPr>
                 <w:rFonts w:ascii="Tahoma" w:hAnsi="Tahoma" w:cs="Tahoma"/>
                 <w:b/>
+                <w:sz w:val="20"/>
+                <w:szCs w:val="20"/>
               </w:rPr>
               <w:t>ENTREGABLES CLAVE</w:t>
             </w:r>
@@ -1349,7 +1473,7 @@
         </w:tc>
         <w:tc>
           <w:tcPr>
-            <w:tcW w:w="2735" w:type="dxa"/>
+            <w:tcW w:w="2591" w:type="dxa"/>
             <w:shd w:val="clear" w:color="auto" w:fill="D9D9D9" w:themeFill="background1" w:themeFillShade="D9"/>
           </w:tcPr>
           <w:p>
@@ -1359,12 +1483,16 @@
               <w:rPr>
                 <w:rFonts w:ascii="Tahoma" w:hAnsi="Tahoma" w:cs="Tahoma"/>
                 <w:b/>
+                <w:sz w:val="20"/>
+                <w:szCs w:val="20"/>
               </w:rPr>
             </w:pPr>
             <w:r>
               <w:rPr>
                 <w:rFonts w:ascii="Tahoma" w:hAnsi="Tahoma" w:cs="Tahoma"/>
                 <w:b/>
+                <w:sz w:val="20"/>
+                <w:szCs w:val="20"/>
               </w:rPr>
               <w:t>CRITERIO DE SALIDA DE LA FASE</w:t>
             </w:r>
@@ -1374,7 +1502,7 @@
       <w:tr>
         <w:tc>
           <w:tcPr>
-            <w:tcW w:w="2735" w:type="dxa"/>
+            <w:tcW w:w="2588" w:type="dxa"/>
           </w:tcPr>
           <w:p>
             <w:pPr>
@@ -1395,7 +1523,7 @@
         </w:tc>
         <w:tc>
           <w:tcPr>
-            <w:tcW w:w="2735" w:type="dxa"/>
+            <w:tcW w:w="2636" w:type="dxa"/>
           </w:tcPr>
           <w:p>
             <w:pPr>
@@ -1464,7 +1592,7 @@
         </w:tc>
         <w:tc>
           <w:tcPr>
-            <w:tcW w:w="2735" w:type="dxa"/>
+            <w:tcW w:w="2641" w:type="dxa"/>
           </w:tcPr>
           <w:p>
             <w:pPr>
@@ -1533,7 +1661,7 @@
         </w:tc>
         <w:tc>
           <w:tcPr>
-            <w:tcW w:w="2735" w:type="dxa"/>
+            <w:tcW w:w="2591" w:type="dxa"/>
           </w:tcPr>
           <w:p>
             <w:pPr>
@@ -1570,7 +1698,7 @@
       <w:tr>
         <w:tc>
           <w:tcPr>
-            <w:tcW w:w="2735" w:type="dxa"/>
+            <w:tcW w:w="2588" w:type="dxa"/>
           </w:tcPr>
           <w:p>
             <w:pPr>
@@ -1591,7 +1719,7 @@
         </w:tc>
         <w:tc>
           <w:tcPr>
-            <w:tcW w:w="2735" w:type="dxa"/>
+            <w:tcW w:w="2636" w:type="dxa"/>
           </w:tcPr>
           <w:p>
             <w:pPr>
@@ -1714,7 +1842,7 @@
         </w:tc>
         <w:tc>
           <w:tcPr>
-            <w:tcW w:w="2735" w:type="dxa"/>
+            <w:tcW w:w="2641" w:type="dxa"/>
           </w:tcPr>
           <w:p>
             <w:pPr>
@@ -1742,7 +1870,7 @@
         </w:tc>
         <w:tc>
           <w:tcPr>
-            <w:tcW w:w="2735" w:type="dxa"/>
+            <w:tcW w:w="2591" w:type="dxa"/>
           </w:tcPr>
           <w:p>
             <w:pPr>
@@ -1765,7 +1893,7 @@
       <w:tr>
         <w:tc>
           <w:tcPr>
-            <w:tcW w:w="2735" w:type="dxa"/>
+            <w:tcW w:w="2588" w:type="dxa"/>
           </w:tcPr>
           <w:p>
             <w:pPr>
@@ -1786,7 +1914,7 @@
         </w:tc>
         <w:tc>
           <w:tcPr>
-            <w:tcW w:w="2735" w:type="dxa"/>
+            <w:tcW w:w="2636" w:type="dxa"/>
           </w:tcPr>
           <w:p>
             <w:pPr>
@@ -1905,22 +2033,68 @@
                 <w:rFonts w:ascii="Tahoma" w:hAnsi="Tahoma" w:cs="Tahoma"/>
                 <w:sz w:val="20"/>
               </w:rPr>
+              <w:t>- Implementa</w:t>
+            </w:r>
+            <w:r>
+              <w:rPr>
+                <w:rFonts w:ascii="Tahoma" w:hAnsi="Tahoma" w:cs="Tahoma"/>
+                <w:sz w:val="20"/>
+              </w:rPr>
+              <w:t>ción</w:t>
+            </w:r>
+            <w:r>
+              <w:rPr>
+                <w:rFonts w:ascii="Tahoma" w:hAnsi="Tahoma" w:cs="Tahoma"/>
+                <w:sz w:val="20"/>
+              </w:rPr>
+              <w:t xml:space="preserve"> sistema de </w:t>
+            </w:r>
+            <w:proofErr w:type="spellStart"/>
+            <w:r>
+              <w:rPr>
+                <w:rFonts w:ascii="Tahoma" w:hAnsi="Tahoma" w:cs="Tahoma"/>
+                <w:sz w:val="20"/>
+              </w:rPr>
+              <w:t>leaderboard</w:t>
+            </w:r>
+            <w:proofErr w:type="spellEnd"/>
+            <w:r>
+              <w:rPr>
+                <w:rFonts w:ascii="Tahoma" w:hAnsi="Tahoma" w:cs="Tahoma"/>
+                <w:sz w:val="20"/>
+              </w:rPr>
+              <w:t xml:space="preserve"> y modelo de IA entrenado</w:t>
+            </w:r>
+            <w:r>
+              <w:rPr>
+                <w:rFonts w:ascii="Tahoma" w:hAnsi="Tahoma" w:cs="Tahoma"/>
+                <w:sz w:val="20"/>
+              </w:rPr>
+              <w:t>.</w:t>
+            </w:r>
+          </w:p>
+          <w:p>
+            <w:pPr>
+              <w:spacing w:after="0" w:afterAutospacing="0"/>
+              <w:rPr>
+                <w:rFonts w:ascii="Tahoma" w:hAnsi="Tahoma" w:cs="Tahoma"/>
+                <w:sz w:val="20"/>
+              </w:rPr>
+            </w:pPr>
+            <w:r>
+              <w:rPr>
+                <w:rFonts w:ascii="Tahoma" w:hAnsi="Tahoma" w:cs="Tahoma"/>
+                <w:sz w:val="20"/>
+              </w:rPr>
               <w:lastRenderedPageBreak/>
-              <w:t>- Implementa</w:t>
-            </w:r>
-            <w:r>
-              <w:rPr>
-                <w:rFonts w:ascii="Tahoma" w:hAnsi="Tahoma" w:cs="Tahoma"/>
-                <w:sz w:val="20"/>
-              </w:rPr>
-              <w:t>ción</w:t>
-            </w:r>
-            <w:r>
-              <w:rPr>
-                <w:rFonts w:ascii="Tahoma" w:hAnsi="Tahoma" w:cs="Tahoma"/>
-                <w:sz w:val="20"/>
-              </w:rPr>
-              <w:t xml:space="preserve"> sistema de </w:t>
+              <w:t>- Diseño</w:t>
+            </w:r>
+            <w:r>
+              <w:rPr>
+                <w:rFonts w:ascii="Tahoma" w:hAnsi="Tahoma" w:cs="Tahoma"/>
+                <w:sz w:val="20"/>
+              </w:rPr>
+              <w:t xml:space="preserve"> y elaboración de los </w:t>
             </w:r>
             <w:proofErr w:type="spellStart"/>
             <w:r>
@@ -1928,7 +2102,7 @@
                 <w:rFonts w:ascii="Tahoma" w:hAnsi="Tahoma" w:cs="Tahoma"/>
                 <w:sz w:val="20"/>
               </w:rPr>
-              <w:t>leaderboard</w:t>
+              <w:t>tests</w:t>
             </w:r>
             <w:proofErr w:type="spellEnd"/>
             <w:r>
@@ -1936,59 +2110,13 @@
                 <w:rFonts w:ascii="Tahoma" w:hAnsi="Tahoma" w:cs="Tahoma"/>
                 <w:sz w:val="20"/>
               </w:rPr>
-              <w:t xml:space="preserve"> y modelo de IA entrenado</w:t>
-            </w:r>
-            <w:r>
-              <w:rPr>
-                <w:rFonts w:ascii="Tahoma" w:hAnsi="Tahoma" w:cs="Tahoma"/>
-                <w:sz w:val="20"/>
-              </w:rPr>
               <w:t>.</w:t>
             </w:r>
           </w:p>
-          <w:p>
-            <w:pPr>
-              <w:spacing w:after="0" w:afterAutospacing="0"/>
-              <w:rPr>
-                <w:rFonts w:ascii="Tahoma" w:hAnsi="Tahoma" w:cs="Tahoma"/>
-                <w:sz w:val="20"/>
-              </w:rPr>
-            </w:pPr>
-            <w:r>
-              <w:rPr>
-                <w:rFonts w:ascii="Tahoma" w:hAnsi="Tahoma" w:cs="Tahoma"/>
-                <w:sz w:val="20"/>
-              </w:rPr>
-              <w:t>- Diseño</w:t>
-            </w:r>
-            <w:r>
-              <w:rPr>
-                <w:rFonts w:ascii="Tahoma" w:hAnsi="Tahoma" w:cs="Tahoma"/>
-                <w:sz w:val="20"/>
-              </w:rPr>
-              <w:t xml:space="preserve"> y elaboración de los </w:t>
-            </w:r>
-            <w:proofErr w:type="spellStart"/>
-            <w:r>
-              <w:rPr>
-                <w:rFonts w:ascii="Tahoma" w:hAnsi="Tahoma" w:cs="Tahoma"/>
-                <w:sz w:val="20"/>
-              </w:rPr>
-              <w:t>tests</w:t>
-            </w:r>
-            <w:proofErr w:type="spellEnd"/>
-            <w:r>
-              <w:rPr>
-                <w:rFonts w:ascii="Tahoma" w:hAnsi="Tahoma" w:cs="Tahoma"/>
-                <w:sz w:val="20"/>
-              </w:rPr>
-              <w:t>.</w:t>
-            </w:r>
-          </w:p>
-        </w:tc>
-        <w:tc>
-          <w:tcPr>
-            <w:tcW w:w="2735" w:type="dxa"/>
+        </w:tc>
+        <w:tc>
+          <w:tcPr>
+            <w:tcW w:w="2641" w:type="dxa"/>
           </w:tcPr>
           <w:p>
             <w:pPr>
@@ -2024,7 +2152,7 @@
         </w:tc>
         <w:tc>
           <w:tcPr>
-            <w:tcW w:w="2735" w:type="dxa"/>
+            <w:tcW w:w="2591" w:type="dxa"/>
           </w:tcPr>
           <w:p>
             <w:pPr>
@@ -2075,7 +2203,7 @@
       <w:tr>
         <w:tc>
           <w:tcPr>
-            <w:tcW w:w="2735" w:type="dxa"/>
+            <w:tcW w:w="2588" w:type="dxa"/>
           </w:tcPr>
           <w:p>
             <w:pPr>
@@ -2096,7 +2224,7 @@
         </w:tc>
         <w:tc>
           <w:tcPr>
-            <w:tcW w:w="2735" w:type="dxa"/>
+            <w:tcW w:w="2636" w:type="dxa"/>
           </w:tcPr>
           <w:p>
             <w:pPr>
@@ -2223,7 +2351,7 @@
         </w:tc>
         <w:tc>
           <w:tcPr>
-            <w:tcW w:w="2735" w:type="dxa"/>
+            <w:tcW w:w="2641" w:type="dxa"/>
           </w:tcPr>
           <w:p>
             <w:pPr>
@@ -2274,7 +2402,7 @@
         </w:tc>
         <w:tc>
           <w:tcPr>
-            <w:tcW w:w="2735" w:type="dxa"/>
+            <w:tcW w:w="2591" w:type="dxa"/>
           </w:tcPr>
           <w:p>
             <w:pPr>
@@ -2319,23 +2447,6 @@
           <w:sz w:val="20"/>
         </w:rPr>
         <w:tab/>
-      </w:r>
-    </w:p>
-    <w:p>
-      <w:pPr>
-        <w:shd w:val="clear" w:color="auto" w:fill="D9D9D9" w:themeFill="background1" w:themeFillShade="D9"/>
-        <w:spacing w:after="0" w:afterAutospacing="0"/>
-        <w:rPr>
-          <w:rFonts w:ascii="Tahoma" w:hAnsi="Tahoma" w:cs="Tahoma"/>
-          <w:b/>
-        </w:rPr>
-      </w:pPr>
-      <w:r>
-        <w:rPr>
-          <w:rFonts w:ascii="Tahoma" w:hAnsi="Tahoma" w:cs="Tahoma"/>
-          <w:b/>
-        </w:rPr>
-        <w:t>DESVIACIONES AUTORIZADAS (NO GENERAN SOLICITUD DE CAMBIO)</w:t>
       </w:r>
     </w:p>
     <w:tbl>
@@ -2351,6 +2462,39 @@
       <w:tr>
         <w:tc>
           <w:tcPr>
+            <w:tcW w:w="10485" w:type="dxa"/>
+            <w:gridSpan w:val="2"/>
+            <w:shd w:val="clear" w:color="auto" w:fill="D9D9D9" w:themeFill="background1" w:themeFillShade="D9"/>
+          </w:tcPr>
+          <w:p>
+            <w:pPr>
+              <w:shd w:val="clear" w:color="auto" w:fill="D9D9D9" w:themeFill="background1" w:themeFillShade="D9"/>
+              <w:spacing w:after="0" w:afterAutospacing="0"/>
+              <w:rPr>
+                <w:rFonts w:ascii="Tahoma" w:hAnsi="Tahoma" w:cs="Tahoma"/>
+                <w:b/>
+                <w:sz w:val="20"/>
+                <w:szCs w:val="20"/>
+              </w:rPr>
+            </w:pPr>
+            <w:r>
+              <w:rPr>
+                <w:rFonts w:ascii="Tahoma" w:hAnsi="Tahoma" w:cs="Tahoma"/>
+                <w:b/>
+                <w:sz w:val="20"/>
+                <w:szCs w:val="20"/>
+              </w:rPr>
+              <w:t>DESVIACIONES AUTORIZADAS (NO GENERAN SOLICITUD DE CAMBIO)</w:t>
+            </w:r>
+          </w:p>
+        </w:tc>
+      </w:tr>
+      <w:tr>
+        <w:trPr>
+          <w:trHeight w:val="247"/>
+        </w:trPr>
+        <w:tc>
+          <w:tcPr>
             <w:tcW w:w="2524" w:type="dxa"/>
             <w:shd w:val="clear" w:color="auto" w:fill="D9D9D9" w:themeFill="background1" w:themeFillShade="D9"/>
           </w:tcPr>
@@ -2361,12 +2505,16 @@
               <w:rPr>
                 <w:rFonts w:ascii="Tahoma" w:hAnsi="Tahoma" w:cs="Tahoma"/>
                 <w:b/>
+                <w:sz w:val="20"/>
+                <w:szCs w:val="20"/>
               </w:rPr>
             </w:pPr>
             <w:r>
               <w:rPr>
                 <w:rFonts w:ascii="Tahoma" w:hAnsi="Tahoma" w:cs="Tahoma"/>
                 <w:b/>
+                <w:sz w:val="20"/>
+                <w:szCs w:val="20"/>
               </w:rPr>
               <w:t>ASPECTO</w:t>
             </w:r>
@@ -2384,12 +2532,16 @@
               <w:rPr>
                 <w:rFonts w:ascii="Tahoma" w:hAnsi="Tahoma" w:cs="Tahoma"/>
                 <w:b/>
+                <w:sz w:val="20"/>
+                <w:szCs w:val="20"/>
               </w:rPr>
             </w:pPr>
             <w:r>
               <w:rPr>
                 <w:rFonts w:ascii="Tahoma" w:hAnsi="Tahoma" w:cs="Tahoma"/>
                 <w:b/>
+                <w:sz w:val="20"/>
+                <w:szCs w:val="20"/>
               </w:rPr>
               <w:t>UMBRALES</w:t>
             </w:r>
@@ -2409,6 +2561,7 @@
                 <w:rFonts w:ascii="Tahoma" w:hAnsi="Tahoma" w:cs="Tahoma"/>
                 <w:b/>
                 <w:sz w:val="20"/>
+                <w:szCs w:val="20"/>
               </w:rPr>
             </w:pPr>
             <w:r>
@@ -2416,6 +2569,7 @@
                 <w:rFonts w:ascii="Tahoma" w:hAnsi="Tahoma" w:cs="Tahoma"/>
                 <w:b/>
                 <w:sz w:val="20"/>
+                <w:szCs w:val="20"/>
               </w:rPr>
               <w:t>ALCANCE</w:t>
             </w:r>
@@ -2463,6 +2617,7 @@
                 <w:rFonts w:ascii="Tahoma" w:hAnsi="Tahoma" w:cs="Tahoma"/>
                 <w:b/>
                 <w:sz w:val="20"/>
+                <w:szCs w:val="20"/>
               </w:rPr>
             </w:pPr>
             <w:r>
@@ -2470,6 +2625,7 @@
                 <w:rFonts w:ascii="Tahoma" w:hAnsi="Tahoma" w:cs="Tahoma"/>
                 <w:b/>
                 <w:sz w:val="20"/>
+                <w:szCs w:val="20"/>
               </w:rPr>
               <w:t>CRONOGRAMA</w:t>
             </w:r>
@@ -2524,6 +2680,7 @@
                 <w:rFonts w:ascii="Tahoma" w:hAnsi="Tahoma" w:cs="Tahoma"/>
                 <w:b/>
                 <w:sz w:val="20"/>
+                <w:szCs w:val="20"/>
               </w:rPr>
             </w:pPr>
             <w:r>
@@ -2531,6 +2688,7 @@
                 <w:rFonts w:ascii="Tahoma" w:hAnsi="Tahoma" w:cs="Tahoma"/>
                 <w:b/>
                 <w:sz w:val="20"/>
+                <w:szCs w:val="20"/>
               </w:rPr>
               <w:t>PRESUPUESTO</w:t>
             </w:r>
@@ -2630,16 +2788,7 @@
     </w:tbl>
     <w:p>
       <w:pPr>
-        <w:spacing w:after="0" w:afterAutospacing="0"/>
-        <w:rPr>
-          <w:rFonts w:ascii="Tahoma" w:hAnsi="Tahoma" w:cs="Tahoma"/>
-          <w:sz w:val="20"/>
-        </w:rPr>
-      </w:pPr>
-    </w:p>
-    <w:p>
-      <w:pPr>
-        <w:shd w:val="clear" w:color="auto" w:fill="D9D9D9" w:themeFill="background1" w:themeFillShade="D9"/>
+        <w:shd w:val="clear" w:color="auto" w:fill="FFFFFF" w:themeFill="background1"/>
         <w:spacing w:after="0" w:afterAutospacing="0"/>
         <w:jc w:val="both"/>
         <w:rPr>
@@ -2647,13 +2796,6 @@
           <w:b/>
         </w:rPr>
       </w:pPr>
-      <w:r>
-        <w:rPr>
-          <w:rFonts w:ascii="Tahoma" w:hAnsi="Tahoma" w:cs="Tahoma"/>
-          <w:b/>
-        </w:rPr>
-        <w:t>CRITERIOS DE ÉXITO</w:t>
-      </w:r>
     </w:p>
     <w:tbl>
       <w:tblPr>
@@ -2667,7 +2809,37 @@
       <w:tr>
         <w:tc>
           <w:tcPr>
-            <w:tcW w:w="10940" w:type="dxa"/>
+            <w:tcW w:w="10456" w:type="dxa"/>
+            <w:shd w:val="clear" w:color="auto" w:fill="D9D9D9" w:themeFill="background1" w:themeFillShade="D9"/>
+          </w:tcPr>
+          <w:p>
+            <w:pPr>
+              <w:shd w:val="clear" w:color="auto" w:fill="D9D9D9" w:themeFill="background1" w:themeFillShade="D9"/>
+              <w:spacing w:after="0" w:afterAutospacing="0"/>
+              <w:jc w:val="both"/>
+              <w:rPr>
+                <w:rFonts w:ascii="Tahoma" w:hAnsi="Tahoma" w:cs="Tahoma"/>
+                <w:b/>
+                <w:sz w:val="20"/>
+                <w:szCs w:val="20"/>
+              </w:rPr>
+            </w:pPr>
+            <w:r>
+              <w:rPr>
+                <w:rFonts w:ascii="Tahoma" w:hAnsi="Tahoma" w:cs="Tahoma"/>
+                <w:b/>
+                <w:sz w:val="20"/>
+                <w:szCs w:val="20"/>
+              </w:rPr>
+              <w:t>CRITERIOS DE ÉXITO</w:t>
+            </w:r>
+          </w:p>
+        </w:tc>
+      </w:tr>
+      <w:tr>
+        <w:tc>
+          <w:tcPr>
+            <w:tcW w:w="10456" w:type="dxa"/>
           </w:tcPr>
           <w:p>
             <w:pPr>
@@ -2861,29 +3033,13 @@
     </w:tbl>
     <w:p>
       <w:pPr>
-        <w:spacing w:after="0" w:afterAutospacing="0"/>
-        <w:jc w:val="both"/>
-        <w:rPr>
-          <w:rFonts w:ascii="Tahoma" w:hAnsi="Tahoma" w:cs="Tahoma"/>
-        </w:rPr>
-      </w:pPr>
-    </w:p>
-    <w:p>
-      <w:pPr>
-        <w:shd w:val="clear" w:color="auto" w:fill="D9D9D9" w:themeFill="background1" w:themeFillShade="D9"/>
+        <w:shd w:val="clear" w:color="auto" w:fill="FFFFFF" w:themeFill="background1"/>
         <w:spacing w:after="0" w:afterAutospacing="0"/>
         <w:rPr>
           <w:rFonts w:ascii="Tahoma" w:hAnsi="Tahoma" w:cs="Tahoma"/>
           <w:b/>
         </w:rPr>
       </w:pPr>
-      <w:r>
-        <w:rPr>
-          <w:rFonts w:ascii="Tahoma" w:hAnsi="Tahoma" w:cs="Tahoma"/>
-          <w:b/>
-        </w:rPr>
-        <w:t>DOCUMENTOS ANEXOS</w:t>
-      </w:r>
     </w:p>
     <w:tbl>
       <w:tblPr>
@@ -2897,118 +3053,28 @@
       <w:tr>
         <w:tc>
           <w:tcPr>
-            <w:tcW w:w="11016" w:type="dxa"/>
-          </w:tcPr>
-          <w:p>
-            <w:pPr>
-              <w:spacing w:afterAutospacing="0"/>
-              <w:rPr>
-                <w:rFonts w:ascii="Tahoma" w:hAnsi="Tahoma" w:cs="Tahoma"/>
-                <w:sz w:val="20"/>
-              </w:rPr>
-            </w:pPr>
-            <w:r>
-              <w:rPr>
-                <w:rFonts w:ascii="Tahoma" w:hAnsi="Tahoma" w:cs="Tahoma"/>
-                <w:sz w:val="20"/>
-              </w:rPr>
-              <w:t>PLAN DE GESTIÓN DE REQUISITOS</w:t>
-            </w:r>
-          </w:p>
-          <w:p>
-            <w:pPr>
-              <w:spacing w:afterAutospacing="0"/>
-              <w:rPr>
-                <w:rFonts w:ascii="Tahoma" w:hAnsi="Tahoma" w:cs="Tahoma"/>
-                <w:sz w:val="20"/>
-              </w:rPr>
-            </w:pPr>
-            <w:r>
-              <w:rPr>
-                <w:rFonts w:ascii="Tahoma" w:hAnsi="Tahoma" w:cs="Tahoma"/>
-                <w:sz w:val="20"/>
-              </w:rPr>
-              <w:t>PLAN DE GESTIÓN DEL ALCANCE</w:t>
-            </w:r>
-          </w:p>
-          <w:p>
-            <w:pPr>
-              <w:spacing w:afterAutospacing="0"/>
-              <w:rPr>
-                <w:rFonts w:ascii="Tahoma" w:hAnsi="Tahoma" w:cs="Tahoma"/>
-                <w:sz w:val="20"/>
-              </w:rPr>
-            </w:pPr>
-            <w:r>
-              <w:rPr>
-                <w:rFonts w:ascii="Tahoma" w:hAnsi="Tahoma" w:cs="Tahoma"/>
-                <w:sz w:val="20"/>
-              </w:rPr>
-              <w:t>PLAN DE GESTIÓN DEL CRONOGRAMA</w:t>
-            </w:r>
-          </w:p>
-          <w:p>
-            <w:pPr>
-              <w:spacing w:afterAutospacing="0"/>
-              <w:rPr>
-                <w:rFonts w:ascii="Tahoma" w:hAnsi="Tahoma" w:cs="Tahoma"/>
-                <w:sz w:val="20"/>
-              </w:rPr>
-            </w:pPr>
-            <w:r>
-              <w:rPr>
-                <w:rFonts w:ascii="Tahoma" w:hAnsi="Tahoma" w:cs="Tahoma"/>
-                <w:sz w:val="20"/>
-              </w:rPr>
-              <w:t>PLAN DE GESTIÓN DE COSTES</w:t>
-            </w:r>
-          </w:p>
-          <w:p>
-            <w:pPr>
-              <w:spacing w:afterAutospacing="0"/>
-              <w:rPr>
-                <w:rFonts w:ascii="Tahoma" w:hAnsi="Tahoma" w:cs="Tahoma"/>
-                <w:sz w:val="20"/>
-              </w:rPr>
-            </w:pPr>
-            <w:r>
-              <w:rPr>
-                <w:rFonts w:ascii="Tahoma" w:hAnsi="Tahoma" w:cs="Tahoma"/>
-                <w:sz w:val="20"/>
-              </w:rPr>
-              <w:t>PLAN DE GESTIÓN DE CALIDAD</w:t>
-            </w:r>
-          </w:p>
-          <w:p>
-            <w:pPr>
-              <w:spacing w:afterAutospacing="0"/>
-              <w:rPr>
-                <w:rFonts w:ascii="Tahoma" w:hAnsi="Tahoma" w:cs="Tahoma"/>
-                <w:sz w:val="20"/>
-              </w:rPr>
-            </w:pPr>
-            <w:r>
-              <w:rPr>
-                <w:rFonts w:ascii="Tahoma" w:hAnsi="Tahoma" w:cs="Tahoma"/>
-                <w:sz w:val="20"/>
-              </w:rPr>
-              <w:t>PLAN DE GESTIÓN DE RIESGOS</w:t>
-            </w:r>
-          </w:p>
-          <w:p>
-            <w:pPr>
-              <w:spacing w:afterAutospacing="0"/>
-              <w:rPr>
-                <w:rFonts w:ascii="Tahoma" w:hAnsi="Tahoma" w:cs="Tahoma"/>
-                <w:sz w:val="20"/>
-              </w:rPr>
-            </w:pPr>
-            <w:r>
-              <w:rPr>
-                <w:rFonts w:ascii="Tahoma" w:hAnsi="Tahoma" w:cs="Tahoma"/>
-                <w:sz w:val="20"/>
-              </w:rPr>
-              <w:t>PLAN DE GESTIÓN DE CAMBIOS</w:t>
+            <w:tcW w:w="10456" w:type="dxa"/>
+            <w:shd w:val="clear" w:color="auto" w:fill="D9D9D9" w:themeFill="background1" w:themeFillShade="D9"/>
+          </w:tcPr>
+          <w:p>
+            <w:pPr>
+              <w:shd w:val="clear" w:color="auto" w:fill="D9D9D9" w:themeFill="background1" w:themeFillShade="D9"/>
+              <w:spacing w:after="0" w:afterAutospacing="0"/>
+              <w:rPr>
+                <w:rFonts w:ascii="Tahoma" w:hAnsi="Tahoma" w:cs="Tahoma"/>
+                <w:b/>
+                <w:sz w:val="20"/>
+                <w:szCs w:val="20"/>
+              </w:rPr>
+            </w:pPr>
+            <w:r>
+              <w:rPr>
+                <w:rFonts w:ascii="Tahoma" w:hAnsi="Tahoma" w:cs="Tahoma"/>
+                <w:b/>
+                <w:sz w:val="20"/>
+                <w:szCs w:val="20"/>
+              </w:rPr>
+              <w:t>DOCUMENTOS ANEXOS</w:t>
             </w:r>
           </w:p>
         </w:tc>
@@ -3016,7 +3082,7 @@
       <w:tr>
         <w:tc>
           <w:tcPr>
-            <w:tcW w:w="11016" w:type="dxa"/>
+            <w:tcW w:w="10456" w:type="dxa"/>
           </w:tcPr>
           <w:p>
             <w:pPr>
@@ -3031,7 +3097,7 @@
                 <w:rFonts w:ascii="Tahoma" w:hAnsi="Tahoma" w:cs="Tahoma"/>
                 <w:sz w:val="20"/>
               </w:rPr>
-              <w:t>LÍNEA BASE DEL ALCANCE: ENUNCIADO DEL ALCANCE, EDT, DICCIONARIO EDT</w:t>
+              <w:t>PLAN DE GESTIÓN DE REQUISITOS</w:t>
             </w:r>
           </w:p>
           <w:p>
@@ -3047,7 +3113,7 @@
                 <w:rFonts w:ascii="Tahoma" w:hAnsi="Tahoma" w:cs="Tahoma"/>
                 <w:sz w:val="20"/>
               </w:rPr>
-              <w:t>LÍNEA BASE DEL CRONOGRAMA: CRONOGRAMA (EN MSPROJECT), LISTA DE HITOS</w:t>
+              <w:t>PLAN DE GESTIÓN DEL ALCANCE</w:t>
             </w:r>
           </w:p>
           <w:p>
@@ -3063,8 +3129,71 @@
                 <w:rFonts w:ascii="Tahoma" w:hAnsi="Tahoma" w:cs="Tahoma"/>
                 <w:sz w:val="20"/>
               </w:rPr>
-              <w:lastRenderedPageBreak/>
-              <w:t>LÍNEA BASE DE COSTES: PRESUPUESTO (CON MSPROJECT), CURVA S DE COSTES (CON MSPROJECT)</w:t>
+              <w:t>PLAN DE GESTIÓN DEL CRONOGRAMA</w:t>
+            </w:r>
+          </w:p>
+          <w:p>
+            <w:pPr>
+              <w:spacing w:afterAutospacing="0"/>
+              <w:rPr>
+                <w:rFonts w:ascii="Tahoma" w:hAnsi="Tahoma" w:cs="Tahoma"/>
+                <w:sz w:val="20"/>
+              </w:rPr>
+            </w:pPr>
+            <w:r>
+              <w:rPr>
+                <w:rFonts w:ascii="Tahoma" w:hAnsi="Tahoma" w:cs="Tahoma"/>
+                <w:sz w:val="20"/>
+              </w:rPr>
+              <w:t>PLAN DE GESTIÓN DE COSTES</w:t>
+            </w:r>
+          </w:p>
+          <w:p>
+            <w:pPr>
+              <w:spacing w:afterAutospacing="0"/>
+              <w:rPr>
+                <w:rFonts w:ascii="Tahoma" w:hAnsi="Tahoma" w:cs="Tahoma"/>
+                <w:sz w:val="20"/>
+              </w:rPr>
+            </w:pPr>
+            <w:r>
+              <w:rPr>
+                <w:rFonts w:ascii="Tahoma" w:hAnsi="Tahoma" w:cs="Tahoma"/>
+                <w:sz w:val="20"/>
+              </w:rPr>
+              <w:t>PLAN DE GESTIÓN DE CALIDAD</w:t>
+            </w:r>
+          </w:p>
+          <w:p>
+            <w:pPr>
+              <w:spacing w:afterAutospacing="0"/>
+              <w:rPr>
+                <w:rFonts w:ascii="Tahoma" w:hAnsi="Tahoma" w:cs="Tahoma"/>
+                <w:sz w:val="20"/>
+              </w:rPr>
+            </w:pPr>
+            <w:r>
+              <w:rPr>
+                <w:rFonts w:ascii="Tahoma" w:hAnsi="Tahoma" w:cs="Tahoma"/>
+                <w:sz w:val="20"/>
+              </w:rPr>
+              <w:t>PLAN DE GESTIÓN DE RIESGOS</w:t>
+            </w:r>
+          </w:p>
+          <w:p>
+            <w:pPr>
+              <w:spacing w:afterAutospacing="0"/>
+              <w:rPr>
+                <w:rFonts w:ascii="Tahoma" w:hAnsi="Tahoma" w:cs="Tahoma"/>
+                <w:sz w:val="20"/>
+              </w:rPr>
+            </w:pPr>
+            <w:r>
+              <w:rPr>
+                <w:rFonts w:ascii="Tahoma" w:hAnsi="Tahoma" w:cs="Tahoma"/>
+                <w:sz w:val="20"/>
+              </w:rPr>
+              <w:t>PLAN DE GESTIÓN DE CAMBIOS</w:t>
             </w:r>
           </w:p>
         </w:tc>
@@ -3072,7 +3201,7 @@
       <w:tr>
         <w:tc>
           <w:tcPr>
-            <w:tcW w:w="11016" w:type="dxa"/>
+            <w:tcW w:w="10456" w:type="dxa"/>
           </w:tcPr>
           <w:p>
             <w:pPr>
@@ -3087,8 +3216,39 @@
                 <w:rFonts w:ascii="Tahoma" w:hAnsi="Tahoma" w:cs="Tahoma"/>
                 <w:sz w:val="20"/>
               </w:rPr>
-              <w:lastRenderedPageBreak/>
-              <w:t>MATRIZ DE TRAZABILIDAD DE REQUISITOS</w:t>
+              <w:t>LÍNEA BASE DEL ALCANCE: ENUNCIADO DEL ALCANCE, EDT, DICCIONARIO EDT</w:t>
+            </w:r>
+          </w:p>
+          <w:p>
+            <w:pPr>
+              <w:spacing w:afterAutospacing="0"/>
+              <w:rPr>
+                <w:rFonts w:ascii="Tahoma" w:hAnsi="Tahoma" w:cs="Tahoma"/>
+                <w:sz w:val="20"/>
+              </w:rPr>
+            </w:pPr>
+            <w:r>
+              <w:rPr>
+                <w:rFonts w:ascii="Tahoma" w:hAnsi="Tahoma" w:cs="Tahoma"/>
+                <w:sz w:val="20"/>
+              </w:rPr>
+              <w:t>LÍNEA BASE DEL CRONOGRAMA: CRONOGRAMA (EN MSPROJECT), LISTA DE HITOS</w:t>
+            </w:r>
+          </w:p>
+          <w:p>
+            <w:pPr>
+              <w:spacing w:afterAutospacing="0"/>
+              <w:rPr>
+                <w:rFonts w:ascii="Tahoma" w:hAnsi="Tahoma" w:cs="Tahoma"/>
+                <w:sz w:val="20"/>
+              </w:rPr>
+            </w:pPr>
+            <w:r>
+              <w:rPr>
+                <w:rFonts w:ascii="Tahoma" w:hAnsi="Tahoma" w:cs="Tahoma"/>
+                <w:sz w:val="20"/>
+              </w:rPr>
+              <w:t>LÍNEA BASE DE COSTES: PRESUPUESTO (CON MSPROJECT), CURVA S DE COSTES (CON MSPROJECT)</w:t>
             </w:r>
           </w:p>
         </w:tc>
@@ -3096,7 +3256,7 @@
       <w:tr>
         <w:tc>
           <w:tcPr>
-            <w:tcW w:w="11016" w:type="dxa"/>
+            <w:tcW w:w="10456" w:type="dxa"/>
           </w:tcPr>
           <w:p>
             <w:pPr>
@@ -3111,6 +3271,29 @@
                 <w:rFonts w:ascii="Tahoma" w:hAnsi="Tahoma" w:cs="Tahoma"/>
                 <w:sz w:val="20"/>
               </w:rPr>
+              <w:t>MATRIZ DE TRAZABILIDAD DE REQUISITOS</w:t>
+            </w:r>
+          </w:p>
+        </w:tc>
+      </w:tr>
+      <w:tr>
+        <w:tc>
+          <w:tcPr>
+            <w:tcW w:w="10456" w:type="dxa"/>
+          </w:tcPr>
+          <w:p>
+            <w:pPr>
+              <w:spacing w:afterAutospacing="0"/>
+              <w:rPr>
+                <w:rFonts w:ascii="Tahoma" w:hAnsi="Tahoma" w:cs="Tahoma"/>
+                <w:sz w:val="20"/>
+              </w:rPr>
+            </w:pPr>
+            <w:r>
+              <w:rPr>
+                <w:rFonts w:ascii="Tahoma" w:hAnsi="Tahoma" w:cs="Tahoma"/>
+                <w:sz w:val="20"/>
+              </w:rPr>
               <w:t>REGISTRO DE REQUISITOS</w:t>
             </w:r>
           </w:p>
@@ -3127,6 +3310,7 @@
                 <w:rFonts w:ascii="Tahoma" w:hAnsi="Tahoma" w:cs="Tahoma"/>
                 <w:sz w:val="20"/>
               </w:rPr>
+              <w:lastRenderedPageBreak/>
               <w:t>REGISTRO DE RIESGOS</w:t>
             </w:r>
           </w:p>
@@ -3135,28 +3319,13 @@
     </w:tbl>
     <w:p>
       <w:pPr>
-        <w:spacing w:after="0" w:afterAutospacing="0"/>
-        <w:rPr>
-          <w:rFonts w:ascii="Tahoma" w:hAnsi="Tahoma" w:cs="Tahoma"/>
-        </w:rPr>
-      </w:pPr>
-    </w:p>
-    <w:p>
-      <w:pPr>
-        <w:shd w:val="clear" w:color="auto" w:fill="D9D9D9" w:themeFill="background1" w:themeFillShade="D9"/>
+        <w:shd w:val="clear" w:color="auto" w:fill="FFFFFF" w:themeFill="background1"/>
         <w:spacing w:after="0" w:afterAutospacing="0"/>
         <w:rPr>
           <w:rFonts w:ascii="Tahoma" w:hAnsi="Tahoma" w:cs="Tahoma"/>
           <w:b/>
         </w:rPr>
       </w:pPr>
-      <w:r>
-        <w:rPr>
-          <w:rFonts w:ascii="Tahoma" w:hAnsi="Tahoma" w:cs="Tahoma"/>
-          <w:b/>
-        </w:rPr>
-        <w:t>APROBACIÓN</w:t>
-      </w:r>
     </w:p>
     <w:tbl>
       <w:tblPr>
@@ -3172,6 +3341,41 @@
       <w:tr>
         <w:tc>
           <w:tcPr>
+            <w:tcW w:w="10485" w:type="dxa"/>
+            <w:gridSpan w:val="3"/>
+            <w:tcBorders>
+              <w:bottom w:val="single" w:sz="4" w:space="0" w:color="auto"/>
+            </w:tcBorders>
+            <w:shd w:val="clear" w:color="auto" w:fill="D9D9D9" w:themeFill="background1" w:themeFillShade="D9"/>
+          </w:tcPr>
+          <w:p>
+            <w:pPr>
+              <w:spacing w:afterAutospacing="0"/>
+              <w:rPr>
+                <w:rFonts w:ascii="Tahoma" w:hAnsi="Tahoma" w:cs="Tahoma"/>
+                <w:b/>
+                <w:sz w:val="20"/>
+                <w:szCs w:val="20"/>
+              </w:rPr>
+            </w:pPr>
+            <w:r>
+              <w:rPr>
+                <w:rFonts w:ascii="Tahoma" w:hAnsi="Tahoma" w:cs="Tahoma"/>
+                <w:b/>
+                <w:sz w:val="20"/>
+                <w:szCs w:val="20"/>
+              </w:rPr>
+              <w:t>APROBACIÓN</w:t>
+            </w:r>
+          </w:p>
+        </w:tc>
+      </w:tr>
+      <w:tr>
+        <w:trPr>
+          <w:trHeight w:val="282"/>
+        </w:trPr>
+        <w:tc>
+          <w:tcPr>
             <w:tcW w:w="2808" w:type="dxa"/>
             <w:tcBorders>
               <w:bottom w:val="single" w:sz="4" w:space="0" w:color="auto"/>
@@ -3185,12 +3389,16 @@
               <w:rPr>
                 <w:rFonts w:ascii="Tahoma" w:hAnsi="Tahoma" w:cs="Tahoma"/>
                 <w:b/>
+                <w:sz w:val="20"/>
+                <w:szCs w:val="20"/>
               </w:rPr>
             </w:pPr>
             <w:r>
               <w:rPr>
                 <w:rFonts w:ascii="Tahoma" w:hAnsi="Tahoma" w:cs="Tahoma"/>
                 <w:b/>
+                <w:sz w:val="20"/>
+                <w:szCs w:val="20"/>
               </w:rPr>
               <w:t>Cargo</w:t>
             </w:r>
@@ -3211,12 +3419,16 @@
               <w:rPr>
                 <w:rFonts w:ascii="Tahoma" w:hAnsi="Tahoma" w:cs="Tahoma"/>
                 <w:b/>
+                <w:sz w:val="20"/>
+                <w:szCs w:val="20"/>
               </w:rPr>
             </w:pPr>
             <w:r>
               <w:rPr>
                 <w:rFonts w:ascii="Tahoma" w:hAnsi="Tahoma" w:cs="Tahoma"/>
                 <w:b/>
+                <w:sz w:val="20"/>
+                <w:szCs w:val="20"/>
               </w:rPr>
               <w:t>Firma</w:t>
             </w:r>
@@ -3237,12 +3449,16 @@
               <w:rPr>
                 <w:rFonts w:ascii="Tahoma" w:hAnsi="Tahoma" w:cs="Tahoma"/>
                 <w:b/>
+                <w:sz w:val="20"/>
+                <w:szCs w:val="20"/>
               </w:rPr>
             </w:pPr>
             <w:r>
               <w:rPr>
                 <w:rFonts w:ascii="Tahoma" w:hAnsi="Tahoma" w:cs="Tahoma"/>
                 <w:b/>
+                <w:sz w:val="20"/>
+                <w:szCs w:val="20"/>
               </w:rPr>
               <w:t>Fecha</w:t>
             </w:r>
@@ -3312,8 +3528,8 @@
     </w:tbl>
     <w:p/>
     <w:sectPr>
-      <w:headerReference w:type="default" r:id="rId7"/>
-      <w:footerReference w:type="default" r:id="rId8"/>
+      <w:headerReference w:type="default" r:id="rId8"/>
+      <w:footerReference w:type="default" r:id="rId9"/>
       <w:pgSz w:w="11906" w:h="16838"/>
       <w:pgMar w:top="720" w:right="720" w:bottom="720" w:left="720" w:header="708" w:footer="708" w:gutter="0"/>
       <w:cols w:space="708"/>
@@ -3526,6 +3742,7 @@
   <w:p>
     <w:pPr>
       <w:pStyle w:val="Encabezado"/>
+      <w:spacing w:after="100"/>
     </w:pPr>
     <w:r>
       <w:rPr>
@@ -3534,7 +3751,7 @@
       <mc:AlternateContent>
         <mc:Choice Requires="wps">
           <w:drawing>
-            <wp:anchor distT="0" distB="0" distL="118745" distR="118745" simplePos="0" relativeHeight="251658240" behindDoc="1" locked="0" layoutInCell="1" allowOverlap="0" wp14:anchorId="25070CCC" wp14:editId="1A82AA6E">
+            <wp:anchor distT="0" distB="0" distL="118745" distR="118745" simplePos="0" relativeHeight="251658240" behindDoc="1" locked="0" layoutInCell="1" allowOverlap="0" wp14:anchorId="25070CCC" wp14:editId="7E44EE74">
               <wp:simplePos x="0" y="0"/>
               <wp:positionH relativeFrom="margin">
                 <wp:align>center</wp:align>
@@ -3596,7 +3813,6 @@
                         <w:sdt>
                           <w:sdtPr>
                             <w:rPr>
-                              <w:rFonts w:ascii="Tahoma" w:hAnsi="Tahoma" w:cs="Tahoma"/>
                               <w:caps/>
                               <w:color w:val="FFFFFF" w:themeColor="background1"/>
                             </w:rPr>
@@ -3606,25 +3822,23 @@
                             <w:dataBinding w:prefixMappings="xmlns:ns0='http://purl.org/dc/elements/1.1/' xmlns:ns1='http://schemas.openxmlformats.org/package/2006/metadata/core-properties' " w:xpath="/ns1:coreProperties[1]/ns0:title[1]" w:storeItemID="{6C3C8BC8-F283-45AE-878A-BAB7291924A1}"/>
                             <w:text/>
                           </w:sdtPr>
-                          <w:sdtEndPr/>
                           <w:sdtContent>
                             <w:p>
                               <w:pPr>
                                 <w:pStyle w:val="Encabezado"/>
+                                <w:spacing w:afterAutospacing="0"/>
                                 <w:jc w:val="center"/>
                                 <w:rPr>
-                                  <w:rFonts w:ascii="Tahoma" w:hAnsi="Tahoma" w:cs="Tahoma"/>
                                   <w:caps/>
                                   <w:color w:val="FFFFFF" w:themeColor="background1"/>
                                 </w:rPr>
                               </w:pPr>
                               <w:r>
                                 <w:rPr>
-                                  <w:rFonts w:ascii="Tahoma" w:hAnsi="Tahoma" w:cs="Tahoma"/>
                                   <w:caps/>
                                   <w:color w:val="FFFFFF" w:themeColor="background1"/>
                                 </w:rPr>
-                                <w:t>PLAN DE DIRECCIÓN DEL PROYECTO</w:t>
+                                <w:t>PLAN DE DIRECCIÓN DEL PROYECTo</w:t>
                               </w:r>
                             </w:p>
                           </w:sdtContent>
@@ -3657,7 +3871,6 @@
                   <w:sdt>
                     <w:sdtPr>
                       <w:rPr>
-                        <w:rFonts w:ascii="Tahoma" w:hAnsi="Tahoma" w:cs="Tahoma"/>
                         <w:caps/>
                         <w:color w:val="FFFFFF" w:themeColor="background1"/>
                       </w:rPr>
@@ -3667,25 +3880,23 @@
                       <w:dataBinding w:prefixMappings="xmlns:ns0='http://purl.org/dc/elements/1.1/' xmlns:ns1='http://schemas.openxmlformats.org/package/2006/metadata/core-properties' " w:xpath="/ns1:coreProperties[1]/ns0:title[1]" w:storeItemID="{6C3C8BC8-F283-45AE-878A-BAB7291924A1}"/>
                       <w:text/>
                     </w:sdtPr>
-                    <w:sdtEndPr/>
                     <w:sdtContent>
                       <w:p>
                         <w:pPr>
                           <w:pStyle w:val="Encabezado"/>
+                          <w:spacing w:afterAutospacing="0"/>
                           <w:jc w:val="center"/>
                           <w:rPr>
-                            <w:rFonts w:ascii="Tahoma" w:hAnsi="Tahoma" w:cs="Tahoma"/>
                             <w:caps/>
                             <w:color w:val="FFFFFF" w:themeColor="background1"/>
                           </w:rPr>
                         </w:pPr>
                         <w:r>
                           <w:rPr>
-                            <w:rFonts w:ascii="Tahoma" w:hAnsi="Tahoma" w:cs="Tahoma"/>
                             <w:caps/>
                             <w:color w:val="FFFFFF" w:themeColor="background1"/>
                           </w:rPr>
-                          <w:t>PLAN DE DIRECCIÓN DEL PROYECTO</w:t>
+                          <w:t>PLAN DE DIRECCIÓN DEL PROYECTo</w:t>
                         </w:r>
                       </w:p>
                     </w:sdtContent>
@@ -6250,4 +6461,16 @@
     </a:ext>
   </a:extLst>
 </a:theme>
+</file>
+
+<file path=customXml/item1.xml><?xml version="1.0" encoding="utf-8"?>
+<b:Sources xmlns:b="http://schemas.openxmlformats.org/officeDocument/2006/bibliography" xmlns="http://schemas.openxmlformats.org/officeDocument/2006/bibliography" SelectedStyle="\APASixthEditionOfficeOnline.xsl" StyleName="APA" Version="6"/>
+</file>
+
+<file path=customXml/itemProps1.xml><?xml version="1.0" encoding="utf-8"?>
+<ds:datastoreItem xmlns:ds="http://schemas.openxmlformats.org/officeDocument/2006/customXml" ds:itemID="{E55B3F40-ACFD-4872-A285-7B62779B2168}">
+  <ds:schemaRefs>
+    <ds:schemaRef ds:uri="http://schemas.openxmlformats.org/officeDocument/2006/bibliography"/>
+  </ds:schemaRefs>
+</ds:datastoreItem>
 </file>
</xml_diff>

<commit_message>
docs: añadir presupuesto al plan de dirección y correcciones formato
</commit_message>
<xml_diff>
--- a/Documentacion/Planificacion/PLAN DE DIRECCIÓN DEL PROYECTO.docx
+++ b/Documentacion/Planificacion/PLAN DE DIRECCIÓN DEL PROYECTO.docx
@@ -1069,27 +1069,7 @@
                 <w:szCs w:val="20"/>
                 <w:lang w:eastAsia="zh-CN"/>
               </w:rPr>
-              <w:t xml:space="preserve">un </w:t>
-            </w:r>
-            <w:proofErr w:type="spellStart"/>
-            <w:r>
-              <w:rPr>
-                <w:rFonts w:ascii="Tahoma" w:eastAsia="SimSun" w:hAnsi="Tahoma" w:cs="Tahoma"/>
-                <w:sz w:val="20"/>
-                <w:szCs w:val="20"/>
-                <w:lang w:eastAsia="zh-CN"/>
-              </w:rPr>
-              <w:t>leaderboard</w:t>
-            </w:r>
-            <w:proofErr w:type="spellEnd"/>
-            <w:r>
-              <w:rPr>
-                <w:rFonts w:ascii="Tahoma" w:eastAsia="SimSun" w:hAnsi="Tahoma" w:cs="Tahoma"/>
-                <w:sz w:val="20"/>
-                <w:szCs w:val="20"/>
-                <w:lang w:eastAsia="zh-CN"/>
-              </w:rPr>
-              <w:t xml:space="preserve"> </w:t>
+              <w:t xml:space="preserve">un leaderboard </w:t>
             </w:r>
             <w:r>
               <w:rPr>
@@ -1538,49 +1518,8 @@
                 <w:rFonts w:ascii="Tahoma" w:hAnsi="Tahoma" w:cs="Tahoma"/>
                 <w:sz w:val="20"/>
               </w:rPr>
-              <w:t xml:space="preserve">- Creación del </w:t>
-            </w:r>
-            <w:proofErr w:type="spellStart"/>
-            <w:r>
-              <w:rPr>
-                <w:rFonts w:ascii="Tahoma" w:hAnsi="Tahoma" w:cs="Tahoma"/>
-                <w:sz w:val="20"/>
-              </w:rPr>
-              <w:t>Game</w:t>
-            </w:r>
-            <w:proofErr w:type="spellEnd"/>
-            <w:r>
-              <w:rPr>
-                <w:rFonts w:ascii="Tahoma" w:hAnsi="Tahoma" w:cs="Tahoma"/>
-                <w:sz w:val="20"/>
-              </w:rPr>
-              <w:t xml:space="preserve"> </w:t>
-            </w:r>
-            <w:proofErr w:type="spellStart"/>
-            <w:r>
-              <w:rPr>
-                <w:rFonts w:ascii="Tahoma" w:hAnsi="Tahoma" w:cs="Tahoma"/>
-                <w:sz w:val="20"/>
-              </w:rPr>
-              <w:t>Design</w:t>
-            </w:r>
-            <w:proofErr w:type="spellEnd"/>
-            <w:r>
-              <w:rPr>
-                <w:rFonts w:ascii="Tahoma" w:hAnsi="Tahoma" w:cs="Tahoma"/>
-                <w:sz w:val="20"/>
-              </w:rPr>
-              <w:t xml:space="preserve"> </w:t>
-            </w:r>
-            <w:proofErr w:type="spellStart"/>
-            <w:r>
-              <w:rPr>
-                <w:rFonts w:ascii="Tahoma" w:hAnsi="Tahoma" w:cs="Tahoma"/>
-                <w:sz w:val="20"/>
-              </w:rPr>
-              <w:t>Document</w:t>
-            </w:r>
-            <w:proofErr w:type="spellEnd"/>
+              <w:t>- Creación del Game Design Document</w:t>
+            </w:r>
             <w:r>
               <w:rPr>
                 <w:rFonts w:ascii="Tahoma" w:hAnsi="Tahoma" w:cs="Tahoma"/>
@@ -1607,49 +1546,8 @@
                 <w:rFonts w:ascii="Tahoma" w:hAnsi="Tahoma" w:cs="Tahoma"/>
                 <w:sz w:val="20"/>
               </w:rPr>
-              <w:t xml:space="preserve">- </w:t>
-            </w:r>
-            <w:proofErr w:type="spellStart"/>
-            <w:r>
-              <w:rPr>
-                <w:rFonts w:ascii="Tahoma" w:hAnsi="Tahoma" w:cs="Tahoma"/>
-                <w:sz w:val="20"/>
-              </w:rPr>
-              <w:t>Game</w:t>
-            </w:r>
-            <w:proofErr w:type="spellEnd"/>
-            <w:r>
-              <w:rPr>
-                <w:rFonts w:ascii="Tahoma" w:hAnsi="Tahoma" w:cs="Tahoma"/>
-                <w:sz w:val="20"/>
-              </w:rPr>
-              <w:t xml:space="preserve"> </w:t>
-            </w:r>
-            <w:proofErr w:type="spellStart"/>
-            <w:r>
-              <w:rPr>
-                <w:rFonts w:ascii="Tahoma" w:hAnsi="Tahoma" w:cs="Tahoma"/>
-                <w:sz w:val="20"/>
-              </w:rPr>
-              <w:t>Design</w:t>
-            </w:r>
-            <w:proofErr w:type="spellEnd"/>
-            <w:r>
-              <w:rPr>
-                <w:rFonts w:ascii="Tahoma" w:hAnsi="Tahoma" w:cs="Tahoma"/>
-                <w:sz w:val="20"/>
-              </w:rPr>
-              <w:t xml:space="preserve"> </w:t>
-            </w:r>
-            <w:proofErr w:type="spellStart"/>
-            <w:r>
-              <w:rPr>
-                <w:rFonts w:ascii="Tahoma" w:hAnsi="Tahoma" w:cs="Tahoma"/>
-                <w:sz w:val="20"/>
-              </w:rPr>
-              <w:t>Document</w:t>
-            </w:r>
-            <w:proofErr w:type="spellEnd"/>
+              <w:t>- Game Design Document</w:t>
+            </w:r>
             <w:r>
               <w:rPr>
                 <w:rFonts w:ascii="Tahoma" w:hAnsi="Tahoma" w:cs="Tahoma"/>
@@ -1957,23 +1855,7 @@
                 <w:rFonts w:ascii="Tahoma" w:hAnsi="Tahoma" w:cs="Tahoma"/>
                 <w:sz w:val="20"/>
               </w:rPr>
-              <w:t xml:space="preserve">las </w:t>
-            </w:r>
-            <w:proofErr w:type="spellStart"/>
-            <w:r>
-              <w:rPr>
-                <w:rFonts w:ascii="Tahoma" w:hAnsi="Tahoma" w:cs="Tahoma"/>
-                <w:sz w:val="20"/>
-              </w:rPr>
-              <w:t>mécanicas</w:t>
-            </w:r>
-            <w:proofErr w:type="spellEnd"/>
-            <w:r>
-              <w:rPr>
-                <w:rFonts w:ascii="Tahoma" w:hAnsi="Tahoma" w:cs="Tahoma"/>
-                <w:sz w:val="20"/>
-              </w:rPr>
-              <w:t xml:space="preserve"> del videojuego</w:t>
+              <w:t>las mécanicas del videojuego</w:t>
             </w:r>
             <w:r>
               <w:rPr>
@@ -2047,23 +1929,7 @@
                 <w:rFonts w:ascii="Tahoma" w:hAnsi="Tahoma" w:cs="Tahoma"/>
                 <w:sz w:val="20"/>
               </w:rPr>
-              <w:t xml:space="preserve"> sistema de </w:t>
-            </w:r>
-            <w:proofErr w:type="spellStart"/>
-            <w:r>
-              <w:rPr>
-                <w:rFonts w:ascii="Tahoma" w:hAnsi="Tahoma" w:cs="Tahoma"/>
-                <w:sz w:val="20"/>
-              </w:rPr>
-              <w:t>leaderboard</w:t>
-            </w:r>
-            <w:proofErr w:type="spellEnd"/>
-            <w:r>
-              <w:rPr>
-                <w:rFonts w:ascii="Tahoma" w:hAnsi="Tahoma" w:cs="Tahoma"/>
-                <w:sz w:val="20"/>
-              </w:rPr>
-              <w:t xml:space="preserve"> y modelo de IA entrenado</w:t>
+              <w:t xml:space="preserve"> sistema de leaderboard y modelo de IA entrenado</w:t>
             </w:r>
             <w:r>
               <w:rPr>
@@ -2094,17 +1960,8 @@
                 <w:rFonts w:ascii="Tahoma" w:hAnsi="Tahoma" w:cs="Tahoma"/>
                 <w:sz w:val="20"/>
               </w:rPr>
-              <w:t xml:space="preserve"> y elaboración de los </w:t>
-            </w:r>
-            <w:proofErr w:type="spellStart"/>
-            <w:r>
-              <w:rPr>
-                <w:rFonts w:ascii="Tahoma" w:hAnsi="Tahoma" w:cs="Tahoma"/>
-                <w:sz w:val="20"/>
-              </w:rPr>
-              <w:t>tests</w:t>
-            </w:r>
-            <w:proofErr w:type="spellEnd"/>
+              <w:t xml:space="preserve"> y elaboración de los tests</w:t>
+            </w:r>
             <w:r>
               <w:rPr>
                 <w:rFonts w:ascii="Tahoma" w:hAnsi="Tahoma" w:cs="Tahoma"/>
@@ -2269,23 +2126,7 @@
                 <w:rFonts w:ascii="Tahoma" w:hAnsi="Tahoma" w:cs="Tahoma"/>
                 <w:sz w:val="20"/>
               </w:rPr>
-              <w:t xml:space="preserve">Entregar </w:t>
-            </w:r>
-            <w:proofErr w:type="spellStart"/>
-            <w:r>
-              <w:rPr>
-                <w:rFonts w:ascii="Tahoma" w:hAnsi="Tahoma" w:cs="Tahoma"/>
-                <w:sz w:val="20"/>
-              </w:rPr>
-              <w:t>build</w:t>
-            </w:r>
-            <w:proofErr w:type="spellEnd"/>
-            <w:r>
-              <w:rPr>
-                <w:rFonts w:ascii="Tahoma" w:hAnsi="Tahoma" w:cs="Tahoma"/>
-                <w:sz w:val="20"/>
-              </w:rPr>
-              <w:t xml:space="preserve"> eje</w:t>
+              <w:t>Entregar build eje</w:t>
             </w:r>
             <w:r>
               <w:rPr>
@@ -2733,16 +2574,7 @@
     </w:tbl>
     <w:p>
       <w:pPr>
-        <w:spacing w:after="0" w:afterAutospacing="0"/>
-        <w:rPr>
-          <w:rFonts w:ascii="Tahoma" w:hAnsi="Tahoma" w:cs="Tahoma"/>
-          <w:sz w:val="20"/>
-        </w:rPr>
-      </w:pPr>
-    </w:p>
-    <w:p>
-      <w:pPr>
-        <w:shd w:val="clear" w:color="auto" w:fill="D9D9D9" w:themeFill="background1" w:themeFillShade="D9"/>
+        <w:shd w:val="clear" w:color="auto" w:fill="FFFFFF" w:themeFill="background1"/>
         <w:spacing w:after="0" w:afterAutospacing="0"/>
         <w:jc w:val="both"/>
         <w:rPr>
@@ -2750,13 +2582,6 @@
           <w:b/>
         </w:rPr>
       </w:pPr>
-      <w:r>
-        <w:rPr>
-          <w:rFonts w:ascii="Tahoma" w:hAnsi="Tahoma" w:cs="Tahoma"/>
-          <w:b/>
-        </w:rPr>
-        <w:t>PRESUPUESTO RESUMIDO</w:t>
-      </w:r>
     </w:p>
     <w:tbl>
       <w:tblPr>
@@ -2770,7 +2595,37 @@
       <w:tr>
         <w:tc>
           <w:tcPr>
-            <w:tcW w:w="10940" w:type="dxa"/>
+            <w:tcW w:w="10456" w:type="dxa"/>
+            <w:shd w:val="clear" w:color="auto" w:fill="D9D9D9" w:themeFill="background1" w:themeFillShade="D9"/>
+          </w:tcPr>
+          <w:p>
+            <w:pPr>
+              <w:shd w:val="clear" w:color="auto" w:fill="D9D9D9" w:themeFill="background1" w:themeFillShade="D9"/>
+              <w:spacing w:after="0" w:afterAutospacing="0"/>
+              <w:jc w:val="both"/>
+              <w:rPr>
+                <w:rFonts w:ascii="Tahoma" w:hAnsi="Tahoma" w:cs="Tahoma"/>
+                <w:b/>
+                <w:sz w:val="20"/>
+                <w:szCs w:val="20"/>
+              </w:rPr>
+            </w:pPr>
+            <w:r>
+              <w:rPr>
+                <w:rFonts w:ascii="Tahoma" w:hAnsi="Tahoma" w:cs="Tahoma"/>
+                <w:b/>
+                <w:sz w:val="20"/>
+                <w:szCs w:val="20"/>
+              </w:rPr>
+              <w:t>PRESUPUESTO RESUMIDO</w:t>
+            </w:r>
+          </w:p>
+        </w:tc>
+      </w:tr>
+      <w:tr>
+        <w:tc>
+          <w:tcPr>
+            <w:tcW w:w="10456" w:type="dxa"/>
           </w:tcPr>
           <w:p>
             <w:pPr>
@@ -2782,6 +2637,35 @@
                 <w:szCs w:val="20"/>
               </w:rPr>
             </w:pPr>
+            <w:r>
+              <w:rPr>
+                <w:rFonts w:ascii="Tahoma" w:hAnsi="Tahoma" w:cs="Tahoma"/>
+                <w:sz w:val="20"/>
+                <w:szCs w:val="20"/>
+              </w:rPr>
+              <w:t xml:space="preserve">El equipo ha estimado que el presupuesto total del proyecto será de </w:t>
+            </w:r>
+            <w:r>
+              <w:rPr>
+                <w:rFonts w:ascii="Tahoma" w:hAnsi="Tahoma" w:cs="Tahoma"/>
+                <w:sz w:val="20"/>
+              </w:rPr>
+              <w:t>23.393</w:t>
+            </w:r>
+            <w:r>
+              <w:rPr>
+                <w:rFonts w:ascii="Tahoma" w:hAnsi="Tahoma" w:cs="Tahoma"/>
+                <w:sz w:val="20"/>
+              </w:rPr>
+              <w:t>€ + IVA</w:t>
+            </w:r>
+            <w:r>
+              <w:rPr>
+                <w:rFonts w:ascii="Tahoma" w:hAnsi="Tahoma" w:cs="Tahoma"/>
+                <w:sz w:val="20"/>
+              </w:rPr>
+              <w:t>.</w:t>
+            </w:r>
           </w:p>
         </w:tc>
       </w:tr>
@@ -2851,6 +2735,7 @@
               <w:spacing w:after="100" w:line="276" w:lineRule="auto"/>
               <w:jc w:val="both"/>
               <w:rPr>
+                <w:rFonts w:ascii="Tahoma" w:hAnsi="Tahoma" w:cs="Tahoma"/>
                 <w:sz w:val="20"/>
                 <w:szCs w:val="20"/>
                 <w:lang w:val="es-PR"/>
@@ -2858,6 +2743,7 @@
             </w:pPr>
             <w:r>
               <w:rPr>
+                <w:rFonts w:ascii="Tahoma" w:hAnsi="Tahoma" w:cs="Tahoma"/>
                 <w:sz w:val="20"/>
                 <w:szCs w:val="20"/>
                 <w:lang w:val="es-PR"/>
@@ -2866,6 +2752,7 @@
             </w:r>
             <w:r>
               <w:rPr>
+                <w:rFonts w:ascii="Tahoma" w:hAnsi="Tahoma" w:cs="Tahoma"/>
                 <w:b/>
                 <w:bCs/>
                 <w:sz w:val="20"/>
@@ -2876,11 +2763,48 @@
             </w:r>
             <w:r>
               <w:rPr>
+                <w:rFonts w:ascii="Tahoma" w:hAnsi="Tahoma" w:cs="Tahoma"/>
                 <w:sz w:val="20"/>
                 <w:szCs w:val="20"/>
                 <w:lang w:val="es-PR"/>
               </w:rPr>
-              <w:t xml:space="preserve"> para garantizar la comprensión y uso del sistema, además del Plan de Dirección Del proyecto.</w:t>
+              <w:t xml:space="preserve"> para garantizar la comprensión y uso del sistema, además del Plan de Dirección </w:t>
+            </w:r>
+            <w:r>
+              <w:rPr>
+                <w:rFonts w:ascii="Tahoma" w:hAnsi="Tahoma" w:cs="Tahoma"/>
+                <w:sz w:val="20"/>
+                <w:szCs w:val="20"/>
+                <w:lang w:val="es-PR"/>
+              </w:rPr>
+              <w:t>d</w:t>
+            </w:r>
+            <w:r>
+              <w:rPr>
+                <w:rFonts w:ascii="Tahoma" w:hAnsi="Tahoma" w:cs="Tahoma"/>
+                <w:sz w:val="20"/>
+                <w:szCs w:val="20"/>
+                <w:lang w:val="es-PR"/>
+              </w:rPr>
+              <w:t xml:space="preserve">el </w:t>
+            </w:r>
+            <w:r>
+              <w:rPr>
+                <w:rFonts w:ascii="Tahoma" w:hAnsi="Tahoma" w:cs="Tahoma"/>
+                <w:sz w:val="20"/>
+                <w:szCs w:val="20"/>
+                <w:lang w:val="es-PR"/>
+              </w:rPr>
+              <w:t>P</w:t>
+            </w:r>
+            <w:r>
+              <w:rPr>
+                <w:rFonts w:ascii="Tahoma" w:hAnsi="Tahoma" w:cs="Tahoma"/>
+                <w:sz w:val="20"/>
+                <w:szCs w:val="20"/>
+                <w:lang w:val="es-PR"/>
+              </w:rPr>
+              <w:t>royecto.</w:t>
             </w:r>
           </w:p>
           <w:p>
@@ -2893,6 +2817,7 @@
               <w:spacing w:after="100" w:line="276" w:lineRule="auto"/>
               <w:jc w:val="both"/>
               <w:rPr>
+                <w:rFonts w:ascii="Tahoma" w:hAnsi="Tahoma" w:cs="Tahoma"/>
                 <w:color w:val="000000" w:themeColor="text1"/>
                 <w:sz w:val="20"/>
                 <w:szCs w:val="20"/>
@@ -2901,6 +2826,7 @@
             </w:pPr>
             <w:r>
               <w:rPr>
+                <w:rFonts w:ascii="Tahoma" w:hAnsi="Tahoma" w:cs="Tahoma"/>
                 <w:color w:val="000000" w:themeColor="text1"/>
                 <w:sz w:val="20"/>
                 <w:szCs w:val="20"/>
@@ -2910,6 +2836,7 @@
             </w:r>
             <w:r>
               <w:rPr>
+                <w:rFonts w:ascii="Tahoma" w:hAnsi="Tahoma" w:cs="Tahoma"/>
                 <w:bCs/>
                 <w:color w:val="000000" w:themeColor="text1"/>
                 <w:sz w:val="20"/>
@@ -2920,6 +2847,7 @@
             </w:r>
             <w:r>
               <w:rPr>
+                <w:rFonts w:ascii="Tahoma" w:hAnsi="Tahoma" w:cs="Tahoma"/>
                 <w:color w:val="000000" w:themeColor="text1"/>
                 <w:sz w:val="20"/>
                 <w:szCs w:val="20"/>
@@ -2938,6 +2866,7 @@
               <w:spacing w:after="100" w:line="276" w:lineRule="auto"/>
               <w:jc w:val="both"/>
               <w:rPr>
+                <w:rFonts w:ascii="Tahoma" w:hAnsi="Tahoma" w:cs="Tahoma"/>
                 <w:color w:val="000000" w:themeColor="text1"/>
                 <w:sz w:val="20"/>
                 <w:szCs w:val="20"/>
@@ -2946,32 +2875,13 @@
             </w:pPr>
             <w:r>
               <w:rPr>
+                <w:rFonts w:ascii="Tahoma" w:hAnsi="Tahoma" w:cs="Tahoma"/>
                 <w:color w:val="000000" w:themeColor="text1"/>
                 <w:sz w:val="20"/>
                 <w:szCs w:val="20"/>
                 <w:lang w:val="es-PR"/>
               </w:rPr>
-              <w:t xml:space="preserve">El sistema de </w:t>
-            </w:r>
-            <w:proofErr w:type="spellStart"/>
-            <w:r>
-              <w:rPr>
-                <w:color w:val="000000" w:themeColor="text1"/>
-                <w:sz w:val="20"/>
-                <w:szCs w:val="20"/>
-                <w:lang w:val="es-PR"/>
-              </w:rPr>
-              <w:t>leaderboard</w:t>
-            </w:r>
-            <w:proofErr w:type="spellEnd"/>
-            <w:r>
-              <w:rPr>
-                <w:color w:val="000000" w:themeColor="text1"/>
-                <w:sz w:val="20"/>
-                <w:szCs w:val="20"/>
-                <w:lang w:val="es-PR"/>
-              </w:rPr>
-              <w:t xml:space="preserve"> y el modelo de IA entrenado deben estar implementados correctamente.</w:t>
+              <w:t>El sistema de leaderboard y el modelo de IA entrenado deben estar implementados correctamente.</w:t>
             </w:r>
           </w:p>
           <w:p>
@@ -2992,6 +2902,7 @@
             </w:pPr>
             <w:r>
               <w:rPr>
+                <w:rFonts w:ascii="Tahoma" w:hAnsi="Tahoma" w:cs="Tahoma"/>
                 <w:color w:val="000000" w:themeColor="text1"/>
                 <w:sz w:val="20"/>
                 <w:szCs w:val="20"/>
@@ -3001,6 +2912,7 @@
             </w:r>
             <w:r>
               <w:rPr>
+                <w:rFonts w:ascii="Tahoma" w:hAnsi="Tahoma" w:cs="Tahoma"/>
                 <w:color w:val="000000" w:themeColor="text1"/>
                 <w:sz w:val="20"/>
                 <w:szCs w:val="20"/>
@@ -3010,6 +2922,7 @@
             </w:r>
             <w:r>
               <w:rPr>
+                <w:rFonts w:ascii="Tahoma" w:hAnsi="Tahoma" w:cs="Tahoma"/>
                 <w:b/>
                 <w:color w:val="000000" w:themeColor="text1"/>
                 <w:sz w:val="20"/>
@@ -3020,6 +2933,7 @@
             </w:r>
             <w:r>
               <w:rPr>
+                <w:rFonts w:ascii="Tahoma" w:hAnsi="Tahoma" w:cs="Tahoma"/>
                 <w:color w:val="000000" w:themeColor="text1"/>
                 <w:sz w:val="20"/>
                 <w:szCs w:val="20"/>
@@ -3822,6 +3736,7 @@
                             <w:dataBinding w:prefixMappings="xmlns:ns0='http://purl.org/dc/elements/1.1/' xmlns:ns1='http://schemas.openxmlformats.org/package/2006/metadata/core-properties' " w:xpath="/ns1:coreProperties[1]/ns0:title[1]" w:storeItemID="{6C3C8BC8-F283-45AE-878A-BAB7291924A1}"/>
                             <w:text/>
                           </w:sdtPr>
+                          <w:sdtEndPr/>
                           <w:sdtContent>
                             <w:p>
                               <w:pPr>
@@ -3880,6 +3795,7 @@
                       <w:dataBinding w:prefixMappings="xmlns:ns0='http://purl.org/dc/elements/1.1/' xmlns:ns1='http://schemas.openxmlformats.org/package/2006/metadata/core-properties' " w:xpath="/ns1:coreProperties[1]/ns0:title[1]" w:storeItemID="{6C3C8BC8-F283-45AE-878A-BAB7291924A1}"/>
                       <w:text/>
                     </w:sdtPr>
+                    <w:sdtEndPr/>
                     <w:sdtContent>
                       <w:p>
                         <w:pPr>

</xml_diff>

<commit_message>
docs: añadir matriz de trazabilidad de requisitos y actuzalizar plan de dirección
</commit_message>
<xml_diff>
--- a/Documentacion/Planificacion/PLAN DE DIRECCIÓN DEL PROYECTO.docx
+++ b/Documentacion/Planificacion/PLAN DE DIRECCIÓN DEL PROYECTO.docx
@@ -55,6 +55,8 @@
             <w:r>
               <w:rPr>
                 <w:rFonts w:ascii="Tahoma" w:hAnsi="Tahoma" w:cs="Tahoma"/>
+                <w:sz w:val="20"/>
+                <w:szCs w:val="20"/>
                 <w:lang w:val="en-US"/>
               </w:rPr>
               <w:t>Rise of the Lost Colors</w:t>
@@ -457,7 +459,16 @@
                 <w:szCs w:val="20"/>
                 <w:lang w:eastAsia="zh-CN"/>
               </w:rPr>
-              <w:t>1.0.0</w:t>
+              <w:t>1.0.</w:t>
+            </w:r>
+            <w:r>
+              <w:rPr>
+                <w:rFonts w:ascii="Tahoma" w:eastAsia="SimSun" w:hAnsi="Tahoma" w:cs="Tahoma"/>
+                <w:sz w:val="20"/>
+                <w:szCs w:val="20"/>
+                <w:lang w:eastAsia="zh-CN"/>
+              </w:rPr>
+              <w:t>1</w:t>
             </w:r>
           </w:p>
         </w:tc>
@@ -752,6 +763,102 @@
           </w:p>
         </w:tc>
       </w:tr>
+      <w:tr>
+        <w:tc>
+          <w:tcPr>
+            <w:tcW w:w="605" w:type="pct"/>
+            <w:tcBorders>
+              <w:top w:val="single" w:sz="4" w:space="0" w:color="7F7F7F" w:themeColor="text1" w:themeTint="80"/>
+              <w:left w:val="single" w:sz="4" w:space="0" w:color="7F7F7F" w:themeColor="text1" w:themeTint="80"/>
+              <w:bottom w:val="single" w:sz="4" w:space="0" w:color="7F7F7F" w:themeColor="text1" w:themeTint="80"/>
+              <w:right w:val="single" w:sz="4" w:space="0" w:color="7F7F7F" w:themeColor="text1" w:themeTint="80"/>
+            </w:tcBorders>
+          </w:tcPr>
+          <w:p>
+            <w:pPr>
+              <w:spacing w:after="0"/>
+              <w:rPr>
+                <w:rFonts w:ascii="Tahoma" w:eastAsia="SimSun" w:hAnsi="Tahoma" w:cs="Tahoma"/>
+                <w:sz w:val="20"/>
+                <w:szCs w:val="20"/>
+                <w:lang w:eastAsia="zh-CN"/>
+              </w:rPr>
+            </w:pPr>
+            <w:r>
+              <w:rPr>
+                <w:rFonts w:ascii="Tahoma" w:eastAsia="SimSun" w:hAnsi="Tahoma" w:cs="Tahoma"/>
+                <w:sz w:val="20"/>
+                <w:szCs w:val="20"/>
+                <w:lang w:eastAsia="zh-CN"/>
+              </w:rPr>
+              <w:t>03/03/2026</w:t>
+            </w:r>
+          </w:p>
+        </w:tc>
+        <w:tc>
+          <w:tcPr>
+            <w:tcW w:w="977" w:type="pct"/>
+            <w:tcBorders>
+              <w:top w:val="single" w:sz="4" w:space="0" w:color="7F7F7F" w:themeColor="text1" w:themeTint="80"/>
+              <w:left w:val="single" w:sz="4" w:space="0" w:color="7F7F7F" w:themeColor="text1" w:themeTint="80"/>
+              <w:bottom w:val="single" w:sz="4" w:space="0" w:color="7F7F7F" w:themeColor="text1" w:themeTint="80"/>
+              <w:right w:val="single" w:sz="4" w:space="0" w:color="7F7F7F" w:themeColor="text1" w:themeTint="80"/>
+            </w:tcBorders>
+          </w:tcPr>
+          <w:p>
+            <w:pPr>
+              <w:widowControl w:val="0"/>
+              <w:spacing w:after="0" w:line="200" w:lineRule="atLeast"/>
+              <w:rPr>
+                <w:rFonts w:ascii="Tahoma" w:eastAsia="SimSun" w:hAnsi="Tahoma" w:cs="Tahoma"/>
+                <w:sz w:val="20"/>
+                <w:szCs w:val="20"/>
+                <w:lang w:eastAsia="zh-CN"/>
+              </w:rPr>
+            </w:pPr>
+            <w:r>
+              <w:rPr>
+                <w:rFonts w:ascii="Tahoma" w:eastAsia="SimSun" w:hAnsi="Tahoma" w:cs="Tahoma"/>
+                <w:sz w:val="20"/>
+                <w:szCs w:val="20"/>
+                <w:lang w:eastAsia="zh-CN"/>
+              </w:rPr>
+              <w:t>Todo el equipo</w:t>
+            </w:r>
+          </w:p>
+        </w:tc>
+        <w:tc>
+          <w:tcPr>
+            <w:tcW w:w="3418" w:type="pct"/>
+            <w:tcBorders>
+              <w:top w:val="single" w:sz="4" w:space="0" w:color="7F7F7F" w:themeColor="text1" w:themeTint="80"/>
+              <w:left w:val="single" w:sz="4" w:space="0" w:color="7F7F7F" w:themeColor="text1" w:themeTint="80"/>
+              <w:bottom w:val="single" w:sz="4" w:space="0" w:color="7F7F7F" w:themeColor="text1" w:themeTint="80"/>
+              <w:right w:val="single" w:sz="4" w:space="0" w:color="7F7F7F" w:themeColor="text1" w:themeTint="80"/>
+            </w:tcBorders>
+          </w:tcPr>
+          <w:p>
+            <w:pPr>
+              <w:spacing w:after="0"/>
+              <w:rPr>
+                <w:rFonts w:ascii="Tahoma" w:eastAsia="SimSun" w:hAnsi="Tahoma" w:cs="Tahoma"/>
+                <w:sz w:val="20"/>
+                <w:szCs w:val="20"/>
+                <w:lang w:eastAsia="zh-CN"/>
+              </w:rPr>
+            </w:pPr>
+            <w:r>
+              <w:rPr>
+                <w:rFonts w:ascii="Tahoma" w:eastAsia="SimSun" w:hAnsi="Tahoma" w:cs="Tahoma"/>
+                <w:sz w:val="20"/>
+                <w:szCs w:val="20"/>
+                <w:lang w:eastAsia="zh-CN"/>
+              </w:rPr>
+              <w:t>Añadir entregables y correcciones menores</w:t>
+            </w:r>
+          </w:p>
+        </w:tc>
+      </w:tr>
     </w:tbl>
     <w:p>
       <w:pPr>
@@ -1069,7 +1176,27 @@
                 <w:szCs w:val="20"/>
                 <w:lang w:eastAsia="zh-CN"/>
               </w:rPr>
-              <w:t xml:space="preserve">un leaderboard </w:t>
+              <w:t xml:space="preserve">un </w:t>
+            </w:r>
+            <w:proofErr w:type="spellStart"/>
+            <w:r>
+              <w:rPr>
+                <w:rFonts w:ascii="Tahoma" w:eastAsia="SimSun" w:hAnsi="Tahoma" w:cs="Tahoma"/>
+                <w:sz w:val="20"/>
+                <w:szCs w:val="20"/>
+                <w:lang w:eastAsia="zh-CN"/>
+              </w:rPr>
+              <w:t>leaderboard</w:t>
+            </w:r>
+            <w:proofErr w:type="spellEnd"/>
+            <w:r>
+              <w:rPr>
+                <w:rFonts w:ascii="Tahoma" w:eastAsia="SimSun" w:hAnsi="Tahoma" w:cs="Tahoma"/>
+                <w:sz w:val="20"/>
+                <w:szCs w:val="20"/>
+                <w:lang w:eastAsia="zh-CN"/>
+              </w:rPr>
+              <w:t xml:space="preserve"> </w:t>
             </w:r>
             <w:r>
               <w:rPr>
@@ -1318,6 +1445,311 @@
         </w:tc>
       </w:tr>
     </w:tbl>
+    <w:p>
+      <w:pPr>
+        <w:spacing w:after="0" w:afterAutospacing="0"/>
+        <w:rPr>
+          <w:rFonts w:ascii="Tahoma" w:hAnsi="Tahoma" w:cs="Tahoma"/>
+          <w:b/>
+        </w:rPr>
+      </w:pPr>
+    </w:p>
+    <w:tbl>
+      <w:tblPr>
+        <w:tblStyle w:val="Tablaconcuadrcula"/>
+        <w:tblW w:w="10485" w:type="dxa"/>
+        <w:tblLook w:val="04A0" w:firstRow="1" w:lastRow="0" w:firstColumn="1" w:lastColumn="0" w:noHBand="0" w:noVBand="1"/>
+      </w:tblPr>
+      <w:tblGrid>
+        <w:gridCol w:w="988"/>
+        <w:gridCol w:w="9497"/>
+      </w:tblGrid>
+      <w:tr>
+        <w:trPr>
+          <w:trHeight w:val="194"/>
+        </w:trPr>
+        <w:tc>
+          <w:tcPr>
+            <w:tcW w:w="10485" w:type="dxa"/>
+            <w:gridSpan w:val="2"/>
+            <w:shd w:val="clear" w:color="auto" w:fill="D9D9D9" w:themeFill="background1" w:themeFillShade="D9"/>
+          </w:tcPr>
+          <w:p>
+            <w:pPr>
+              <w:shd w:val="clear" w:color="auto" w:fill="D9D9D9" w:themeFill="background1" w:themeFillShade="D9"/>
+              <w:spacing w:after="0" w:afterAutospacing="0"/>
+              <w:jc w:val="both"/>
+              <w:rPr>
+                <w:rFonts w:ascii="Tahoma" w:hAnsi="Tahoma" w:cs="Tahoma"/>
+                <w:b/>
+                <w:sz w:val="20"/>
+                <w:szCs w:val="20"/>
+              </w:rPr>
+            </w:pPr>
+            <w:r>
+              <w:rPr>
+                <w:rFonts w:ascii="Tahoma" w:hAnsi="Tahoma" w:cs="Tahoma"/>
+                <w:b/>
+                <w:sz w:val="20"/>
+                <w:szCs w:val="20"/>
+              </w:rPr>
+              <w:t>ENTREGABLES</w:t>
+            </w:r>
+            <w:r>
+              <w:rPr>
+                <w:rFonts w:ascii="Tahoma" w:hAnsi="Tahoma" w:cs="Tahoma"/>
+                <w:b/>
+                <w:sz w:val="20"/>
+                <w:szCs w:val="20"/>
+              </w:rPr>
+              <w:t xml:space="preserve"> DEL PROYECTO</w:t>
+            </w:r>
+          </w:p>
+        </w:tc>
+      </w:tr>
+      <w:tr>
+        <w:trPr>
+          <w:trHeight w:val="200"/>
+        </w:trPr>
+        <w:tc>
+          <w:tcPr>
+            <w:tcW w:w="988" w:type="dxa"/>
+            <w:shd w:val="clear" w:color="auto" w:fill="D9D9D9" w:themeFill="background1" w:themeFillShade="D9"/>
+          </w:tcPr>
+          <w:p>
+            <w:pPr>
+              <w:shd w:val="clear" w:color="auto" w:fill="D9D9D9" w:themeFill="background1" w:themeFillShade="D9"/>
+              <w:spacing w:after="0" w:afterAutospacing="0"/>
+              <w:jc w:val="both"/>
+              <w:rPr>
+                <w:rFonts w:ascii="Tahoma" w:hAnsi="Tahoma" w:cs="Tahoma"/>
+                <w:b/>
+                <w:sz w:val="20"/>
+                <w:szCs w:val="20"/>
+              </w:rPr>
+            </w:pPr>
+            <w:r>
+              <w:rPr>
+                <w:rFonts w:ascii="Tahoma" w:hAnsi="Tahoma" w:cs="Tahoma"/>
+                <w:b/>
+                <w:sz w:val="20"/>
+                <w:szCs w:val="20"/>
+              </w:rPr>
+              <w:t>Id</w:t>
+            </w:r>
+          </w:p>
+        </w:tc>
+        <w:tc>
+          <w:tcPr>
+            <w:tcW w:w="9497" w:type="dxa"/>
+            <w:shd w:val="clear" w:color="auto" w:fill="D9D9D9" w:themeFill="background1" w:themeFillShade="D9"/>
+          </w:tcPr>
+          <w:p>
+            <w:pPr>
+              <w:shd w:val="clear" w:color="auto" w:fill="D9D9D9" w:themeFill="background1" w:themeFillShade="D9"/>
+              <w:spacing w:after="0" w:afterAutospacing="0"/>
+              <w:jc w:val="both"/>
+              <w:rPr>
+                <w:rFonts w:ascii="Tahoma" w:hAnsi="Tahoma" w:cs="Tahoma"/>
+                <w:b/>
+                <w:sz w:val="20"/>
+                <w:szCs w:val="20"/>
+              </w:rPr>
+            </w:pPr>
+            <w:r>
+              <w:rPr>
+                <w:rFonts w:ascii="Tahoma" w:hAnsi="Tahoma" w:cs="Tahoma"/>
+                <w:b/>
+                <w:sz w:val="20"/>
+                <w:szCs w:val="20"/>
+              </w:rPr>
+              <w:t>Entregable</w:t>
+            </w:r>
+          </w:p>
+        </w:tc>
+      </w:tr>
+      <w:tr>
+        <w:trPr>
+          <w:trHeight w:val="367"/>
+        </w:trPr>
+        <w:tc>
+          <w:tcPr>
+            <w:tcW w:w="988" w:type="dxa"/>
+            <w:vAlign w:val="center"/>
+          </w:tcPr>
+          <w:p>
+            <w:pPr>
+              <w:spacing w:afterAutospacing="0"/>
+              <w:jc w:val="center"/>
+              <w:rPr>
+                <w:rFonts w:ascii="Tahoma" w:eastAsia="SimSun" w:hAnsi="Tahoma" w:cs="Tahoma"/>
+                <w:sz w:val="20"/>
+                <w:szCs w:val="20"/>
+                <w:lang w:eastAsia="zh-CN"/>
+              </w:rPr>
+            </w:pPr>
+            <w:r>
+              <w:rPr>
+                <w:rFonts w:ascii="Tahoma" w:eastAsia="SimSun" w:hAnsi="Tahoma" w:cs="Tahoma"/>
+                <w:sz w:val="20"/>
+                <w:szCs w:val="20"/>
+                <w:lang w:eastAsia="zh-CN"/>
+              </w:rPr>
+              <w:t>E</w:t>
+            </w:r>
+            <w:r>
+              <w:rPr>
+                <w:rFonts w:ascii="Tahoma" w:eastAsia="SimSun" w:hAnsi="Tahoma" w:cs="Tahoma"/>
+                <w:sz w:val="20"/>
+                <w:szCs w:val="20"/>
+                <w:lang w:eastAsia="zh-CN"/>
+              </w:rPr>
+              <w:t>1</w:t>
+            </w:r>
+          </w:p>
+        </w:tc>
+        <w:tc>
+          <w:tcPr>
+            <w:tcW w:w="9497" w:type="dxa"/>
+          </w:tcPr>
+          <w:p>
+            <w:pPr>
+              <w:spacing w:afterAutospacing="0"/>
+              <w:rPr>
+                <w:rFonts w:ascii="Tahoma" w:eastAsia="SimSun" w:hAnsi="Tahoma" w:cs="Tahoma"/>
+                <w:sz w:val="20"/>
+                <w:szCs w:val="20"/>
+                <w:lang w:eastAsia="zh-CN"/>
+              </w:rPr>
+            </w:pPr>
+            <w:r>
+              <w:rPr>
+                <w:rFonts w:ascii="Tahoma" w:eastAsia="SimSun" w:hAnsi="Tahoma" w:cs="Tahoma"/>
+                <w:b/>
+                <w:bCs/>
+                <w:sz w:val="20"/>
+                <w:szCs w:val="20"/>
+                <w:lang w:eastAsia="zh-CN"/>
+              </w:rPr>
+              <w:t>Videojuego:</w:t>
+            </w:r>
+            <w:r>
+              <w:rPr>
+                <w:rFonts w:ascii="Tahoma" w:eastAsia="SimSun" w:hAnsi="Tahoma" w:cs="Tahoma"/>
+                <w:sz w:val="20"/>
+                <w:szCs w:val="20"/>
+                <w:lang w:eastAsia="zh-CN"/>
+              </w:rPr>
+              <w:t xml:space="preserve"> Ejecutable funcional del juego desarrollado en Godot, con todos los niveles, mecánicas y contenido audiovisual implementados.</w:t>
+            </w:r>
+            <w:r>
+              <w:rPr>
+                <w:rFonts w:ascii="Tahoma" w:eastAsia="SimSun" w:hAnsi="Tahoma" w:cs="Tahoma"/>
+                <w:sz w:val="20"/>
+                <w:szCs w:val="20"/>
+                <w:lang w:eastAsia="zh-CN"/>
+              </w:rPr>
+              <w:t xml:space="preserve"> Incluye también el código fuente para su corrección</w:t>
+            </w:r>
+            <w:r>
+              <w:rPr>
+                <w:rFonts w:ascii="Tahoma" w:eastAsia="SimSun" w:hAnsi="Tahoma" w:cs="Tahoma"/>
+                <w:sz w:val="20"/>
+                <w:szCs w:val="20"/>
+                <w:lang w:eastAsia="zh-CN"/>
+              </w:rPr>
+              <w:t>.</w:t>
+            </w:r>
+          </w:p>
+        </w:tc>
+      </w:tr>
+      <w:tr>
+        <w:trPr>
+          <w:trHeight w:val="379"/>
+        </w:trPr>
+        <w:tc>
+          <w:tcPr>
+            <w:tcW w:w="988" w:type="dxa"/>
+            <w:vAlign w:val="center"/>
+          </w:tcPr>
+          <w:p>
+            <w:pPr>
+              <w:spacing w:afterAutospacing="0"/>
+              <w:jc w:val="center"/>
+              <w:rPr>
+                <w:rFonts w:ascii="Tahoma" w:eastAsia="SimSun" w:hAnsi="Tahoma" w:cs="Tahoma"/>
+                <w:sz w:val="20"/>
+                <w:szCs w:val="20"/>
+                <w:lang w:eastAsia="zh-CN"/>
+              </w:rPr>
+            </w:pPr>
+            <w:r>
+              <w:rPr>
+                <w:rFonts w:ascii="Tahoma" w:eastAsia="SimSun" w:hAnsi="Tahoma" w:cs="Tahoma"/>
+                <w:sz w:val="20"/>
+                <w:szCs w:val="20"/>
+                <w:lang w:eastAsia="zh-CN"/>
+              </w:rPr>
+              <w:t>E</w:t>
+            </w:r>
+            <w:r>
+              <w:rPr>
+                <w:rFonts w:ascii="Tahoma" w:eastAsia="SimSun" w:hAnsi="Tahoma" w:cs="Tahoma"/>
+                <w:sz w:val="20"/>
+                <w:szCs w:val="20"/>
+                <w:lang w:eastAsia="zh-CN"/>
+              </w:rPr>
+              <w:t>2</w:t>
+            </w:r>
+          </w:p>
+        </w:tc>
+        <w:tc>
+          <w:tcPr>
+            <w:tcW w:w="9497" w:type="dxa"/>
+          </w:tcPr>
+          <w:p>
+            <w:pPr>
+              <w:spacing w:afterAutospacing="0"/>
+              <w:rPr>
+                <w:rFonts w:ascii="Tahoma" w:eastAsia="SimSun" w:hAnsi="Tahoma" w:cs="Tahoma"/>
+                <w:sz w:val="20"/>
+                <w:szCs w:val="20"/>
+                <w:lang w:eastAsia="zh-CN"/>
+              </w:rPr>
+            </w:pPr>
+            <w:r>
+              <w:rPr>
+                <w:rFonts w:ascii="Tahoma" w:eastAsia="SimSun" w:hAnsi="Tahoma" w:cs="Tahoma"/>
+                <w:b/>
+                <w:bCs/>
+                <w:sz w:val="20"/>
+                <w:szCs w:val="20"/>
+                <w:lang w:eastAsia="zh-CN"/>
+              </w:rPr>
+              <w:t>Memoria del proyecto:</w:t>
+            </w:r>
+            <w:r>
+              <w:rPr>
+                <w:rFonts w:ascii="Tahoma" w:eastAsia="SimSun" w:hAnsi="Tahoma" w:cs="Tahoma"/>
+                <w:sz w:val="20"/>
+                <w:szCs w:val="20"/>
+                <w:lang w:eastAsia="zh-CN"/>
+              </w:rPr>
+              <w:t xml:space="preserve"> Documento técnico que recoge el análisis, diseño, desarrollo y conclusiones del videojuego, incluyendo el GDD y la justificación de las decisiones tomadas.</w:t>
+            </w:r>
+          </w:p>
+        </w:tc>
+      </w:tr>
+    </w:tbl>
+    <w:p>
+      <w:pPr>
+        <w:spacing w:after="0" w:afterAutospacing="0"/>
+        <w:rPr>
+          <w:rFonts w:ascii="Tahoma" w:hAnsi="Tahoma" w:cs="Tahoma"/>
+          <w:b/>
+        </w:rPr>
+      </w:pPr>
+    </w:p>
     <w:p>
       <w:pPr>
         <w:spacing w:after="0" w:afterAutospacing="0"/>
@@ -1518,8 +1950,49 @@
                 <w:rFonts w:ascii="Tahoma" w:hAnsi="Tahoma" w:cs="Tahoma"/>
                 <w:sz w:val="20"/>
               </w:rPr>
-              <w:t>- Creación del Game Design Document</w:t>
-            </w:r>
+              <w:t xml:space="preserve">- Creación del </w:t>
+            </w:r>
+            <w:proofErr w:type="spellStart"/>
+            <w:r>
+              <w:rPr>
+                <w:rFonts w:ascii="Tahoma" w:hAnsi="Tahoma" w:cs="Tahoma"/>
+                <w:sz w:val="20"/>
+              </w:rPr>
+              <w:t>Game</w:t>
+            </w:r>
+            <w:proofErr w:type="spellEnd"/>
+            <w:r>
+              <w:rPr>
+                <w:rFonts w:ascii="Tahoma" w:hAnsi="Tahoma" w:cs="Tahoma"/>
+                <w:sz w:val="20"/>
+              </w:rPr>
+              <w:t xml:space="preserve"> </w:t>
+            </w:r>
+            <w:proofErr w:type="spellStart"/>
+            <w:r>
+              <w:rPr>
+                <w:rFonts w:ascii="Tahoma" w:hAnsi="Tahoma" w:cs="Tahoma"/>
+                <w:sz w:val="20"/>
+              </w:rPr>
+              <w:t>Design</w:t>
+            </w:r>
+            <w:proofErr w:type="spellEnd"/>
+            <w:r>
+              <w:rPr>
+                <w:rFonts w:ascii="Tahoma" w:hAnsi="Tahoma" w:cs="Tahoma"/>
+                <w:sz w:val="20"/>
+              </w:rPr>
+              <w:t xml:space="preserve"> </w:t>
+            </w:r>
+            <w:proofErr w:type="spellStart"/>
+            <w:r>
+              <w:rPr>
+                <w:rFonts w:ascii="Tahoma" w:hAnsi="Tahoma" w:cs="Tahoma"/>
+                <w:sz w:val="20"/>
+              </w:rPr>
+              <w:t>Document</w:t>
+            </w:r>
+            <w:proofErr w:type="spellEnd"/>
             <w:r>
               <w:rPr>
                 <w:rFonts w:ascii="Tahoma" w:hAnsi="Tahoma" w:cs="Tahoma"/>
@@ -1546,8 +2019,49 @@
                 <w:rFonts w:ascii="Tahoma" w:hAnsi="Tahoma" w:cs="Tahoma"/>
                 <w:sz w:val="20"/>
               </w:rPr>
-              <w:t>- Game Design Document</w:t>
-            </w:r>
+              <w:t xml:space="preserve">- </w:t>
+            </w:r>
+            <w:proofErr w:type="spellStart"/>
+            <w:r>
+              <w:rPr>
+                <w:rFonts w:ascii="Tahoma" w:hAnsi="Tahoma" w:cs="Tahoma"/>
+                <w:sz w:val="20"/>
+              </w:rPr>
+              <w:t>Game</w:t>
+            </w:r>
+            <w:proofErr w:type="spellEnd"/>
+            <w:r>
+              <w:rPr>
+                <w:rFonts w:ascii="Tahoma" w:hAnsi="Tahoma" w:cs="Tahoma"/>
+                <w:sz w:val="20"/>
+              </w:rPr>
+              <w:t xml:space="preserve"> </w:t>
+            </w:r>
+            <w:proofErr w:type="spellStart"/>
+            <w:r>
+              <w:rPr>
+                <w:rFonts w:ascii="Tahoma" w:hAnsi="Tahoma" w:cs="Tahoma"/>
+                <w:sz w:val="20"/>
+              </w:rPr>
+              <w:t>Design</w:t>
+            </w:r>
+            <w:proofErr w:type="spellEnd"/>
+            <w:r>
+              <w:rPr>
+                <w:rFonts w:ascii="Tahoma" w:hAnsi="Tahoma" w:cs="Tahoma"/>
+                <w:sz w:val="20"/>
+              </w:rPr>
+              <w:t xml:space="preserve"> </w:t>
+            </w:r>
+            <w:proofErr w:type="spellStart"/>
+            <w:r>
+              <w:rPr>
+                <w:rFonts w:ascii="Tahoma" w:hAnsi="Tahoma" w:cs="Tahoma"/>
+                <w:sz w:val="20"/>
+              </w:rPr>
+              <w:t>Document</w:t>
+            </w:r>
+            <w:proofErr w:type="spellEnd"/>
             <w:r>
               <w:rPr>
                 <w:rFonts w:ascii="Tahoma" w:hAnsi="Tahoma" w:cs="Tahoma"/>
@@ -1669,6 +2183,7 @@
                 <w:rFonts w:ascii="Tahoma" w:hAnsi="Tahoma" w:cs="Tahoma"/>
                 <w:sz w:val="20"/>
               </w:rPr>
+              <w:lastRenderedPageBreak/>
               <w:t xml:space="preserve">- </w:t>
             </w:r>
             <w:r>
@@ -1755,6 +2270,7 @@
                 <w:rFonts w:ascii="Tahoma" w:hAnsi="Tahoma" w:cs="Tahoma"/>
                 <w:sz w:val="20"/>
               </w:rPr>
+              <w:lastRenderedPageBreak/>
               <w:t>- Plan de Dirección de Proyecto</w:t>
             </w:r>
             <w:r>
@@ -1855,7 +2371,23 @@
                 <w:rFonts w:ascii="Tahoma" w:hAnsi="Tahoma" w:cs="Tahoma"/>
                 <w:sz w:val="20"/>
               </w:rPr>
-              <w:t>las mécanicas del videojuego</w:t>
+              <w:t xml:space="preserve">las </w:t>
+            </w:r>
+            <w:proofErr w:type="spellStart"/>
+            <w:r>
+              <w:rPr>
+                <w:rFonts w:ascii="Tahoma" w:hAnsi="Tahoma" w:cs="Tahoma"/>
+                <w:sz w:val="20"/>
+              </w:rPr>
+              <w:t>mécanicas</w:t>
+            </w:r>
+            <w:proofErr w:type="spellEnd"/>
+            <w:r>
+              <w:rPr>
+                <w:rFonts w:ascii="Tahoma" w:hAnsi="Tahoma" w:cs="Tahoma"/>
+                <w:sz w:val="20"/>
+              </w:rPr>
+              <w:t xml:space="preserve"> del videojuego</w:t>
             </w:r>
             <w:r>
               <w:rPr>
@@ -1929,7 +2461,23 @@
                 <w:rFonts w:ascii="Tahoma" w:hAnsi="Tahoma" w:cs="Tahoma"/>
                 <w:sz w:val="20"/>
               </w:rPr>
-              <w:t xml:space="preserve"> sistema de leaderboard y modelo de IA entrenado</w:t>
+              <w:t xml:space="preserve"> sistema de </w:t>
+            </w:r>
+            <w:proofErr w:type="spellStart"/>
+            <w:r>
+              <w:rPr>
+                <w:rFonts w:ascii="Tahoma" w:hAnsi="Tahoma" w:cs="Tahoma"/>
+                <w:sz w:val="20"/>
+              </w:rPr>
+              <w:t>leaderboard</w:t>
+            </w:r>
+            <w:proofErr w:type="spellEnd"/>
+            <w:r>
+              <w:rPr>
+                <w:rFonts w:ascii="Tahoma" w:hAnsi="Tahoma" w:cs="Tahoma"/>
+                <w:sz w:val="20"/>
+              </w:rPr>
+              <w:t xml:space="preserve"> y modelo de IA entrenado</w:t>
             </w:r>
             <w:r>
               <w:rPr>
@@ -1952,7 +2500,6 @@
                 <w:rFonts w:ascii="Tahoma" w:hAnsi="Tahoma" w:cs="Tahoma"/>
                 <w:sz w:val="20"/>
               </w:rPr>
-              <w:lastRenderedPageBreak/>
               <w:t>- Diseño</w:t>
             </w:r>
             <w:r>
@@ -1960,8 +2507,17 @@
                 <w:rFonts w:ascii="Tahoma" w:hAnsi="Tahoma" w:cs="Tahoma"/>
                 <w:sz w:val="20"/>
               </w:rPr>
-              <w:t xml:space="preserve"> y elaboración de los tests</w:t>
-            </w:r>
+              <w:t xml:space="preserve"> y elaboración de los </w:t>
+            </w:r>
+            <w:proofErr w:type="spellStart"/>
+            <w:r>
+              <w:rPr>
+                <w:rFonts w:ascii="Tahoma" w:hAnsi="Tahoma" w:cs="Tahoma"/>
+                <w:sz w:val="20"/>
+              </w:rPr>
+              <w:t>tests</w:t>
+            </w:r>
+            <w:proofErr w:type="spellEnd"/>
             <w:r>
               <w:rPr>
                 <w:rFonts w:ascii="Tahoma" w:hAnsi="Tahoma" w:cs="Tahoma"/>
@@ -1988,7 +2544,6 @@
                 <w:rFonts w:ascii="Tahoma" w:hAnsi="Tahoma" w:cs="Tahoma"/>
                 <w:sz w:val="20"/>
               </w:rPr>
-              <w:lastRenderedPageBreak/>
               <w:t xml:space="preserve">- Juego </w:t>
             </w:r>
             <w:r>
@@ -2126,7 +2681,23 @@
                 <w:rFonts w:ascii="Tahoma" w:hAnsi="Tahoma" w:cs="Tahoma"/>
                 <w:sz w:val="20"/>
               </w:rPr>
-              <w:t>Entregar build eje</w:t>
+              <w:t xml:space="preserve">Entregar </w:t>
+            </w:r>
+            <w:proofErr w:type="spellStart"/>
+            <w:r>
+              <w:rPr>
+                <w:rFonts w:ascii="Tahoma" w:hAnsi="Tahoma" w:cs="Tahoma"/>
+                <w:sz w:val="20"/>
+              </w:rPr>
+              <w:t>build</w:t>
+            </w:r>
+            <w:proofErr w:type="spellEnd"/>
+            <w:r>
+              <w:rPr>
+                <w:rFonts w:ascii="Tahoma" w:hAnsi="Tahoma" w:cs="Tahoma"/>
+                <w:sz w:val="20"/>
+              </w:rPr>
+              <w:t xml:space="preserve"> eje</w:t>
             </w:r>
             <w:r>
               <w:rPr>
@@ -2881,7 +3452,29 @@
                 <w:szCs w:val="20"/>
                 <w:lang w:val="es-PR"/>
               </w:rPr>
-              <w:t>El sistema de leaderboard y el modelo de IA entrenado deben estar implementados correctamente.</w:t>
+              <w:t xml:space="preserve">El sistema de </w:t>
+            </w:r>
+            <w:proofErr w:type="spellStart"/>
+            <w:r>
+              <w:rPr>
+                <w:rFonts w:ascii="Tahoma" w:hAnsi="Tahoma" w:cs="Tahoma"/>
+                <w:color w:val="000000" w:themeColor="text1"/>
+                <w:sz w:val="20"/>
+                <w:szCs w:val="20"/>
+                <w:lang w:val="es-PR"/>
+              </w:rPr>
+              <w:t>leaderboard</w:t>
+            </w:r>
+            <w:proofErr w:type="spellEnd"/>
+            <w:r>
+              <w:rPr>
+                <w:rFonts w:ascii="Tahoma" w:hAnsi="Tahoma" w:cs="Tahoma"/>
+                <w:color w:val="000000" w:themeColor="text1"/>
+                <w:sz w:val="20"/>
+                <w:szCs w:val="20"/>
+                <w:lang w:val="es-PR"/>
+              </w:rPr>
+              <w:t xml:space="preserve"> y el modelo de IA entrenado deben estar implementados correctamente.</w:t>
             </w:r>
           </w:p>
           <w:p>
@@ -3075,6 +3668,7 @@
                 <w:rFonts w:ascii="Tahoma" w:hAnsi="Tahoma" w:cs="Tahoma"/>
                 <w:sz w:val="20"/>
               </w:rPr>
+              <w:lastRenderedPageBreak/>
               <w:t>PLAN DE GESTIÓN DE CALIDAD</w:t>
             </w:r>
           </w:p>
@@ -3130,6 +3724,7 @@
                 <w:rFonts w:ascii="Tahoma" w:hAnsi="Tahoma" w:cs="Tahoma"/>
                 <w:sz w:val="20"/>
               </w:rPr>
+              <w:lastRenderedPageBreak/>
               <w:t>LÍNEA BASE DEL ALCANCE: ENUNCIADO DEL ALCANCE, EDT, DICCIONARIO EDT</w:t>
             </w:r>
           </w:p>
@@ -3224,7 +3819,6 @@
                 <w:rFonts w:ascii="Tahoma" w:hAnsi="Tahoma" w:cs="Tahoma"/>
                 <w:sz w:val="20"/>
               </w:rPr>
-              <w:lastRenderedPageBreak/>
               <w:t>REGISTRO DE RIESGOS</w:t>
             </w:r>
           </w:p>
@@ -5639,7 +6233,6 @@
   <w:style w:type="character" w:default="1" w:styleId="Fuentedeprrafopredeter">
     <w:name w:val="Default Paragraph Font"/>
     <w:uiPriority w:val="1"/>
-    <w:semiHidden/>
     <w:unhideWhenUsed/>
   </w:style>
   <w:style w:type="table" w:default="1" w:styleId="Tablanormal">

</xml_diff>

<commit_message>
fix: arreglar costes y inluir cronograma
se arreglan costes y se incluye el cronograma del sprint 1
</commit_message>
<xml_diff>
--- a/Documentacion/Planificacion/PLAN DE DIRECCIÓN DEL PROYECTO.docx
+++ b/Documentacion/Planificacion/PLAN DE DIRECCIÓN DEL PROYECTO.docx
@@ -3166,7 +3166,34 @@
                 <w:szCs w:val="20"/>
                 <w:lang w:val="es-ES"/>
               </w:rPr>
-              <w:t>28.535,10</w:t>
+              <w:t>28.</w:t>
+            </w:r>
+            <w:r>
+              <w:rPr>
+                <w:rFonts w:ascii="Tahoma" w:eastAsia="Tahoma" w:hAnsi="Tahoma" w:cs="Tahoma"/>
+                <w:sz w:val="20"/>
+                <w:szCs w:val="20"/>
+                <w:lang w:val="es-ES"/>
+              </w:rPr>
+              <w:t>107</w:t>
+            </w:r>
+            <w:r>
+              <w:rPr>
+                <w:rFonts w:ascii="Tahoma" w:eastAsia="Tahoma" w:hAnsi="Tahoma" w:cs="Tahoma"/>
+                <w:sz w:val="20"/>
+                <w:szCs w:val="20"/>
+                <w:lang w:val="es-ES"/>
+              </w:rPr>
+              <w:t>,</w:t>
+            </w:r>
+            <w:r>
+              <w:rPr>
+                <w:rFonts w:ascii="Tahoma" w:eastAsia="Tahoma" w:hAnsi="Tahoma" w:cs="Tahoma"/>
+                <w:sz w:val="20"/>
+                <w:szCs w:val="20"/>
+                <w:lang w:val="es-ES"/>
+              </w:rPr>
+              <w:t>75</w:t>
             </w:r>
             <w:r>
               <w:rPr>

</xml_diff>